<commit_message>
Initial commit: CodeKids Enterprise platform setup
</commit_message>
<xml_diff>
--- a/CodeKids_Enterprise_平台介绍与技术架构完整版.docx
+++ b/CodeKids_Enterprise_平台介绍与技术架构完整版.docx
@@ -91,6 +91,32 @@
       <w:r>
         <w:t>- 👨‍👩‍👧‍👦 家校联动闭环</w:t>
       </w:r>
+    </w:p>
+    <w:p>
+      <w:pPr>
+        <w:rPr>
+          <w:rFonts w:hint="eastAsia" w:eastAsia="宋体"/>
+          <w:lang w:val="en-US" w:eastAsia="zh-CN"/>
+        </w:rPr>
+      </w:pPr>
+      <w:bookmarkStart w:id="0" w:name="_GoBack"/>
+      <w:bookmarkEnd w:id="0"/>
+      <w:r>
+        <w:rPr>
+          <w:rFonts w:hint="eastAsia" w:eastAsia="宋体"/>
+          <w:lang w:val="en-US" w:eastAsia="zh-CN"/>
+        </w:rPr>
+        <w:t>- 时间天气系统，个人城市，小家</w:t>
+      </w:r>
+    </w:p>
+    <w:p>
+      <w:r>
+        <w:rPr>
+          <w:rFonts w:hint="eastAsia" w:eastAsia="宋体"/>
+          <w:lang w:val="en-US" w:eastAsia="zh-CN"/>
+        </w:rPr>
+        <w:t>- 自定义头像</w:t>
+      </w:r>
       <w:r>
         <w:br w:type="textWrapping"/>
       </w:r>
@@ -98,10 +124,23 @@
     <w:p>
       <w:pPr>
         <w:pStyle w:val="4"/>
+        <w:numPr>
+          <w:ilvl w:val="0"/>
+          <w:numId w:val="7"/>
+        </w:numPr>
       </w:pPr>
       <w:r>
-        <w:t>二、功能全景图</w:t>
-      </w:r>
+        <w:t>功能全景图</w:t>
+      </w:r>
+    </w:p>
+    <w:p>
+      <w:pPr>
+        <w:numPr>
+          <w:ilvl w:val="0"/>
+          <w:numId w:val="0"/>
+        </w:numPr>
+        <w:spacing w:after="200" w:line="276" w:lineRule="auto"/>
+      </w:pPr>
     </w:p>
     <w:tbl>
       <w:tblPr>
@@ -175,7 +214,7 @@
           </w:tcPr>
           <w:p>
             <w:r>
-              <w:t>AI国度修复计划（48~60节课），跟随剧情掌握编程知识。</w:t>
+              <w:t>主线任务  AI国度修复计划（48~60节课），跟随剧情掌握编程知识，现已融入AI子系统经验任务，学生可以通过代码体验如 ai.ask(), tts.say() 等AI调用功能。</w:t>
             </w:r>
           </w:p>
         </w:tc>
@@ -235,7 +274,7 @@
           </w:tcPr>
           <w:p>
             <w:r>
-              <w:t>游戏、动画、应用自由开发，支持素材市场、组件复用。</w:t>
+              <w:t>游戏、动画、应用自由开发，支持精选素材、AI模型调用、组件复用，重点培养创作力。</w:t>
             </w:r>
           </w:p>
         </w:tc>
@@ -325,7 +364,7 @@
           </w:tcPr>
           <w:p>
             <w:r>
-              <w:t>错误检测、自动修复、代码补全、语音朗读、实时翻译、符号纠错。</w:t>
+              <w:t>错误检测、自动修复、代码补全、语音朗读、实时翻译、符号纠错。支持基本类Prompt设计，培养AI思维。</w:t>
             </w:r>
           </w:p>
         </w:tc>
@@ -527,6 +566,27 @@
         <w:t>- 代码编辑器</w:t>
       </w:r>
       <w:r>
+        <w:rPr>
+          <w:rFonts w:hint="eastAsia" w:eastAsia="宋体"/>
+          <w:lang w:eastAsia="zh-CN"/>
+        </w:rPr>
+        <w:t>（</w:t>
+      </w:r>
+      <w:r>
+        <w:rPr>
+          <w:rFonts w:hint="eastAsia" w:eastAsia="宋体"/>
+          <w:lang w:val="en-US" w:eastAsia="zh-CN"/>
+        </w:rPr>
+        <w:t>高亮，补全，tab缩进等常用功能，补全时显示中文，可读单词</w:t>
+      </w:r>
+      <w:r>
+        <w:rPr>
+          <w:rFonts w:hint="eastAsia" w:eastAsia="宋体"/>
+          <w:lang w:eastAsia="zh-CN"/>
+        </w:rPr>
+        <w:t>）</w:t>
+      </w:r>
+      <w:r>
         <w:br w:type="textWrapping"/>
       </w:r>
       <w:r>
@@ -831,8 +891,6 @@
       <w:r>
         <w:t>- 鼠标悬停提示错误 → 点击一键修复为英文符号。</w:t>
       </w:r>
-      <w:bookmarkStart w:id="0" w:name="_GoBack"/>
-      <w:bookmarkEnd w:id="0"/>
     </w:p>
     <w:p>
       <w:pPr>
@@ -1419,6 +1477,21 @@
       </w:rPr>
     </w:lvl>
   </w:abstractNum>
+  <w:abstractNum w:abstractNumId="6">
+    <w:nsid w:val="74A346BC"/>
+    <w:multiLevelType w:val="singleLevel"/>
+    <w:tmpl w:val="74A346BC"/>
+    <w:lvl w:ilvl="0" w:tentative="0">
+      <w:start w:val="2"/>
+      <w:numFmt w:val="chineseCounting"/>
+      <w:suff w:val="nothing"/>
+      <w:lvlText w:val="%1、"/>
+      <w:lvlJc w:val="left"/>
+      <w:rPr>
+        <w:rFonts w:hint="eastAsia"/>
+      </w:rPr>
+    </w:lvl>
+  </w:abstractNum>
   <w:num w:numId="1">
     <w:abstractNumId w:val="1"/>
   </w:num>
@@ -1436,6 +1509,9 @@
   </w:num>
   <w:num w:numId="6">
     <w:abstractNumId w:val="3"/>
+  </w:num>
+  <w:num w:numId="7">
+    <w:abstractNumId w:val="6"/>
   </w:num>
 </w:numbering>
 </file>
@@ -1496,13 +1572,13 @@
     <w:lsdException w:uiPriority="99" w:name="endnote reference"/>
     <w:lsdException w:uiPriority="99" w:name="endnote text"/>
     <w:lsdException w:uiPriority="99" w:name="table of authorities"/>
-    <w:lsdException w:uiPriority="99" w:semiHidden="0" w:name="macro"/>
+    <w:lsdException w:qFormat="1" w:uiPriority="99" w:semiHidden="0" w:name="macro"/>
     <w:lsdException w:uiPriority="99" w:name="toa heading"/>
     <w:lsdException w:uiPriority="99" w:semiHidden="0" w:name="List"/>
     <w:lsdException w:qFormat="1" w:uiPriority="99" w:semiHidden="0" w:name="List Bullet"/>
     <w:lsdException w:uiPriority="99" w:semiHidden="0" w:name="List Number"/>
     <w:lsdException w:uiPriority="99" w:semiHidden="0" w:name="List 2"/>
-    <w:lsdException w:uiPriority="99" w:semiHidden="0" w:name="List 3"/>
+    <w:lsdException w:qFormat="1" w:uiPriority="99" w:semiHidden="0" w:name="List 3"/>
     <w:lsdException w:uiPriority="99" w:name="List 4"/>
     <w:lsdException w:uiPriority="99" w:name="List 5"/>
     <w:lsdException w:uiPriority="99" w:semiHidden="0" w:name="List Bullet 2"/>
@@ -1516,7 +1592,7 @@
     <w:lsdException w:qFormat="1" w:unhideWhenUsed="0" w:uiPriority="10" w:semiHidden="0" w:name="Title"/>
     <w:lsdException w:uiPriority="99" w:name="Closing"/>
     <w:lsdException w:uiPriority="99" w:name="Signature"/>
-    <w:lsdException w:uiPriority="1" w:name="Default Paragraph Font"/>
+    <w:lsdException w:qFormat="1" w:uiPriority="1" w:name="Default Paragraph Font"/>
     <w:lsdException w:qFormat="1" w:uiPriority="99" w:semiHidden="0" w:name="Body Text"/>
     <w:lsdException w:uiPriority="99" w:name="Body Text Indent"/>
     <w:lsdException w:uiPriority="99" w:semiHidden="0" w:name="List Continue"/>
@@ -1554,7 +1630,7 @@
     <w:lsdException w:uiPriority="99" w:name="HTML Sample"/>
     <w:lsdException w:uiPriority="99" w:name="HTML Typewriter"/>
     <w:lsdException w:uiPriority="99" w:name="HTML Variable"/>
-    <w:lsdException w:uiPriority="99" w:name="Normal Table"/>
+    <w:lsdException w:qFormat="1" w:uiPriority="99" w:name="Normal Table"/>
     <w:lsdException w:uiPriority="99" w:name="annotation subject"/>
     <w:lsdException w:uiPriority="99" w:name="Table Simple 1"/>
     <w:lsdException w:uiPriority="99" w:name="Table Simple 2"/>
@@ -1603,7 +1679,7 @@
     <w:lsdException w:uiPriority="99" w:name="Table Theme"/>
     <w:lsdException w:qFormat="1" w:unhideWhenUsed="0" w:uiPriority="1" w:semiHidden="0" w:name="No Spacing"/>
     <w:lsdException w:unhideWhenUsed="0" w:uiPriority="60" w:semiHidden="0" w:name="Light Shading"/>
-    <w:lsdException w:unhideWhenUsed="0" w:uiPriority="61" w:semiHidden="0" w:name="Light List"/>
+    <w:lsdException w:qFormat="1" w:unhideWhenUsed="0" w:uiPriority="61" w:semiHidden="0" w:name="Light List"/>
     <w:lsdException w:qFormat="1" w:unhideWhenUsed="0" w:uiPriority="62" w:semiHidden="0" w:name="Light Grid"/>
     <w:lsdException w:qFormat="1" w:unhideWhenUsed="0" w:uiPriority="63" w:semiHidden="0" w:name="Medium Shading 1"/>
     <w:lsdException w:qFormat="1" w:unhideWhenUsed="0" w:uiPriority="64" w:semiHidden="0" w:name="Medium Shading 2"/>
@@ -1648,9 +1724,9 @@
     <w:lsdException w:qFormat="1" w:unhideWhenUsed="0" w:uiPriority="72" w:semiHidden="0" w:name="Colorful List Accent 2"/>
     <w:lsdException w:qFormat="1" w:unhideWhenUsed="0" w:uiPriority="73" w:semiHidden="0" w:name="Colorful Grid Accent 2"/>
     <w:lsdException w:qFormat="1" w:unhideWhenUsed="0" w:uiPriority="60" w:semiHidden="0" w:name="Light Shading Accent 3"/>
-    <w:lsdException w:unhideWhenUsed="0" w:uiPriority="61" w:semiHidden="0" w:name="Light List Accent 3"/>
-    <w:lsdException w:unhideWhenUsed="0" w:uiPriority="62" w:semiHidden="0" w:name="Light Grid Accent 3"/>
-    <w:lsdException w:unhideWhenUsed="0" w:uiPriority="63" w:semiHidden="0" w:name="Medium Shading 1 Accent 3"/>
+    <w:lsdException w:qFormat="1" w:unhideWhenUsed="0" w:uiPriority="61" w:semiHidden="0" w:name="Light List Accent 3"/>
+    <w:lsdException w:qFormat="1" w:unhideWhenUsed="0" w:uiPriority="62" w:semiHidden="0" w:name="Light Grid Accent 3"/>
+    <w:lsdException w:qFormat="1" w:unhideWhenUsed="0" w:uiPriority="63" w:semiHidden="0" w:name="Medium Shading 1 Accent 3"/>
     <w:lsdException w:qFormat="1" w:unhideWhenUsed="0" w:uiPriority="64" w:semiHidden="0" w:name="Medium Shading 2 Accent 3"/>
     <w:lsdException w:qFormat="1" w:unhideWhenUsed="0" w:uiPriority="65" w:semiHidden="0" w:name="Medium List 1 Accent 3"/>
     <w:lsdException w:qFormat="1" w:unhideWhenUsed="0" w:uiPriority="66" w:semiHidden="0" w:name="Medium List 2 Accent 3"/>
@@ -1676,7 +1752,7 @@
     <w:lsdException w:qFormat="1" w:unhideWhenUsed="0" w:uiPriority="72" w:semiHidden="0" w:name="Colorful List Accent 4"/>
     <w:lsdException w:qFormat="1" w:unhideWhenUsed="0" w:uiPriority="73" w:semiHidden="0" w:name="Colorful Grid Accent 4"/>
     <w:lsdException w:qFormat="1" w:unhideWhenUsed="0" w:uiPriority="60" w:semiHidden="0" w:name="Light Shading Accent 5"/>
-    <w:lsdException w:unhideWhenUsed="0" w:uiPriority="61" w:semiHidden="0" w:name="Light List Accent 5"/>
+    <w:lsdException w:qFormat="1" w:unhideWhenUsed="0" w:uiPriority="61" w:semiHidden="0" w:name="Light List Accent 5"/>
     <w:lsdException w:qFormat="1" w:unhideWhenUsed="0" w:uiPriority="62" w:semiHidden="0" w:name="Light Grid Accent 5"/>
     <w:lsdException w:qFormat="1" w:unhideWhenUsed="0" w:uiPriority="63" w:semiHidden="0" w:name="Medium Shading 1 Accent 5"/>
     <w:lsdException w:qFormat="1" w:unhideWhenUsed="0" w:uiPriority="64" w:semiHidden="0" w:name="Medium Shading 2 Accent 5"/>
@@ -1689,8 +1765,8 @@
     <w:lsdException w:qFormat="1" w:unhideWhenUsed="0" w:uiPriority="71" w:semiHidden="0" w:name="Colorful Shading Accent 5"/>
     <w:lsdException w:qFormat="1" w:unhideWhenUsed="0" w:uiPriority="72" w:semiHidden="0" w:name="Colorful List Accent 5"/>
     <w:lsdException w:qFormat="1" w:unhideWhenUsed="0" w:uiPriority="73" w:semiHidden="0" w:name="Colorful Grid Accent 5"/>
-    <w:lsdException w:unhideWhenUsed="0" w:uiPriority="60" w:semiHidden="0" w:name="Light Shading Accent 6"/>
-    <w:lsdException w:unhideWhenUsed="0" w:uiPriority="61" w:semiHidden="0" w:name="Light List Accent 6"/>
+    <w:lsdException w:qFormat="1" w:unhideWhenUsed="0" w:uiPriority="60" w:semiHidden="0" w:name="Light Shading Accent 6"/>
+    <w:lsdException w:qFormat="1" w:unhideWhenUsed="0" w:uiPriority="61" w:semiHidden="0" w:name="Light List Accent 6"/>
     <w:lsdException w:qFormat="1" w:unhideWhenUsed="0" w:uiPriority="62" w:semiHidden="0" w:name="Light Grid Accent 6"/>
     <w:lsdException w:qFormat="1" w:unhideWhenUsed="0" w:uiPriority="63" w:semiHidden="0" w:name="Medium Shading 1 Accent 6"/>
     <w:lsdException w:qFormat="1" w:unhideWhenUsed="0" w:uiPriority="64" w:semiHidden="0" w:name="Medium Shading 2 Accent 6"/>
@@ -1958,12 +2034,14 @@
     <w:name w:val="Default Paragraph Font"/>
     <w:semiHidden/>
     <w:unhideWhenUsed/>
+    <w:qFormat/>
     <w:uiPriority w:val="1"/>
   </w:style>
   <w:style w:type="table" w:default="1" w:styleId="32">
     <w:name w:val="Normal Table"/>
     <w:semiHidden/>
     <w:unhideWhenUsed/>
+    <w:qFormat/>
     <w:uiPriority w:val="99"/>
     <w:tblPr>
       <w:tblCellMar>
@@ -1978,6 +2056,7 @@
     <w:name w:val="macro"/>
     <w:link w:val="147"/>
     <w:unhideWhenUsed/>
+    <w:qFormat/>
     <w:uiPriority w:val="99"/>
     <w:pPr>
       <w:tabs>
@@ -2002,6 +2081,7 @@
     <w:name w:val="List 3"/>
     <w:basedOn w:val="1"/>
     <w:unhideWhenUsed/>
+    <w:qFormat/>
     <w:uiPriority w:val="99"/>
     <w:pPr>
       <w:ind w:left="1080" w:hanging="360"/>
@@ -2900,6 +2980,7 @@
   <w:style w:type="table" w:styleId="40">
     <w:name w:val="Light Shading Accent 6"/>
     <w:basedOn w:val="32"/>
+    <w:qFormat/>
     <w:uiPriority w:val="60"/>
     <w:pPr>
       <w:spacing w:after="0" w:line="240" w:lineRule="auto"/>
@@ -2999,6 +3080,7 @@
   <w:style w:type="table" w:styleId="41">
     <w:name w:val="Light List"/>
     <w:basedOn w:val="32"/>
+    <w:qFormat/>
     <w:uiPriority w:val="61"/>
     <w:pPr>
       <w:spacing w:after="0" w:line="240" w:lineRule="auto"/>
@@ -3280,6 +3362,7 @@
   <w:style w:type="table" w:styleId="44">
     <w:name w:val="Light List Accent 3"/>
     <w:basedOn w:val="32"/>
+    <w:qFormat/>
     <w:uiPriority w:val="61"/>
     <w:pPr>
       <w:spacing w:after="0" w:line="240" w:lineRule="auto"/>
@@ -3467,6 +3550,7 @@
   <w:style w:type="table" w:styleId="46">
     <w:name w:val="Light List Accent 5"/>
     <w:basedOn w:val="32"/>
+    <w:qFormat/>
     <w:uiPriority w:val="61"/>
     <w:pPr>
       <w:spacing w:after="0" w:line="240" w:lineRule="auto"/>
@@ -3560,6 +3644,7 @@
   <w:style w:type="table" w:styleId="47">
     <w:name w:val="Light List Accent 6"/>
     <w:basedOn w:val="32"/>
+    <w:qFormat/>
     <w:uiPriority w:val="61"/>
     <w:pPr>
       <w:spacing w:after="0" w:line="240" w:lineRule="auto"/>
@@ -4034,6 +4119,7 @@
   <w:style w:type="table" w:styleId="51">
     <w:name w:val="Light Grid Accent 3"/>
     <w:basedOn w:val="32"/>
+    <w:qFormat/>
     <w:uiPriority w:val="62"/>
     <w:pPr>
       <w:spacing w:after="0" w:line="240" w:lineRule="auto"/>
@@ -4865,6 +4951,7 @@
   <w:style w:type="table" w:styleId="58">
     <w:name w:val="Medium Shading 1 Accent 3"/>
     <w:basedOn w:val="32"/>
+    <w:qFormat/>
     <w:uiPriority w:val="63"/>
     <w:pPr>
       <w:spacing w:after="0" w:line="240" w:lineRule="auto"/>
@@ -13816,12 +13903,14 @@
     <w:name w:val="Header Char"/>
     <w:basedOn w:val="132"/>
     <w:link w:val="25"/>
+    <w:qFormat/>
     <w:uiPriority w:val="99"/>
   </w:style>
   <w:style w:type="character" w:customStyle="1" w:styleId="136">
     <w:name w:val="Footer Char"/>
     <w:basedOn w:val="132"/>
     <w:link w:val="24"/>
+    <w:qFormat/>
     <w:uiPriority w:val="99"/>
   </w:style>
   <w:style w:type="paragraph" w:styleId="137">
@@ -13842,6 +13931,7 @@
     <w:name w:val="Heading 1 Char"/>
     <w:basedOn w:val="132"/>
     <w:link w:val="3"/>
+    <w:qFormat/>
     <w:uiPriority w:val="9"/>
     <w:rPr>
       <w:rFonts w:asciiTheme="majorHAnsi" w:hAnsiTheme="majorHAnsi" w:eastAsiaTheme="majorEastAsia" w:cstheme="majorBidi"/>
@@ -13856,6 +13946,7 @@
     <w:name w:val="Heading 2 Char"/>
     <w:basedOn w:val="132"/>
     <w:link w:val="4"/>
+    <w:qFormat/>
     <w:uiPriority w:val="9"/>
     <w:rPr>
       <w:rFonts w:asciiTheme="majorHAnsi" w:hAnsiTheme="majorHAnsi" w:eastAsiaTheme="majorEastAsia" w:cstheme="majorBidi"/>
@@ -13875,6 +13966,7 @@
     <w:name w:val="Heading 3 Char"/>
     <w:basedOn w:val="132"/>
     <w:link w:val="5"/>
+    <w:qFormat/>
     <w:uiPriority w:val="9"/>
     <w:rPr>
       <w:rFonts w:asciiTheme="majorHAnsi" w:hAnsiTheme="majorHAnsi" w:eastAsiaTheme="majorEastAsia" w:cstheme="majorBidi"/>
@@ -13892,6 +13984,7 @@
     <w:name w:val="Title Char"/>
     <w:basedOn w:val="132"/>
     <w:link w:val="31"/>
+    <w:qFormat/>
     <w:uiPriority w:val="10"/>
     <w:rPr>
       <w:rFonts w:asciiTheme="majorHAnsi" w:hAnsiTheme="majorHAnsi" w:eastAsiaTheme="majorEastAsia" w:cstheme="majorBidi"/>
@@ -13937,6 +14030,7 @@
     <w:name w:val="Body Text Char"/>
     <w:basedOn w:val="132"/>
     <w:link w:val="19"/>
+    <w:qFormat/>
     <w:uiPriority w:val="99"/>
   </w:style>
   <w:style w:type="character" w:customStyle="1" w:styleId="145">
@@ -13961,6 +14055,7 @@
     <w:name w:val="Macro Text Char"/>
     <w:basedOn w:val="132"/>
     <w:link w:val="2"/>
+    <w:qFormat/>
     <w:uiPriority w:val="99"/>
     <w:rPr>
       <w:rFonts w:ascii="Courier" w:hAnsi="Courier"/>
@@ -13990,6 +14085,7 @@
     <w:name w:val="Quote Char"/>
     <w:basedOn w:val="132"/>
     <w:link w:val="148"/>
+    <w:qFormat/>
     <w:uiPriority w:val="29"/>
     <w:rPr>
       <w:i/>
@@ -14028,6 +14124,7 @@
     <w:basedOn w:val="132"/>
     <w:link w:val="7"/>
     <w:semiHidden/>
+    <w:qFormat/>
     <w:uiPriority w:val="9"/>
     <w:rPr>
       <w:rFonts w:asciiTheme="majorHAnsi" w:hAnsiTheme="majorHAnsi" w:eastAsiaTheme="majorEastAsia" w:cstheme="majorBidi"/>
@@ -14039,6 +14136,7 @@
     <w:basedOn w:val="132"/>
     <w:link w:val="8"/>
     <w:semiHidden/>
+    <w:qFormat/>
     <w:uiPriority w:val="9"/>
     <w:rPr>
       <w:rFonts w:asciiTheme="majorHAnsi" w:hAnsiTheme="majorHAnsi" w:eastAsiaTheme="majorEastAsia" w:cstheme="majorBidi"/>
@@ -14052,6 +14150,7 @@
     <w:basedOn w:val="132"/>
     <w:link w:val="9"/>
     <w:semiHidden/>
+    <w:qFormat/>
     <w:uiPriority w:val="9"/>
     <w:rPr>
       <w:rFonts w:asciiTheme="majorHAnsi" w:hAnsiTheme="majorHAnsi" w:eastAsiaTheme="majorEastAsia" w:cstheme="majorBidi"/>
@@ -14073,6 +14172,7 @@
     <w:basedOn w:val="132"/>
     <w:link w:val="10"/>
     <w:semiHidden/>
+    <w:qFormat/>
     <w:uiPriority w:val="9"/>
     <w:rPr>
       <w:rFonts w:asciiTheme="majorHAnsi" w:hAnsiTheme="majorHAnsi" w:eastAsiaTheme="majorEastAsia" w:cstheme="majorBidi"/>
@@ -14091,6 +14191,7 @@
     <w:basedOn w:val="132"/>
     <w:link w:val="11"/>
     <w:semiHidden/>
+    <w:qFormat/>
     <w:uiPriority w:val="9"/>
     <w:rPr>
       <w:rFonts w:asciiTheme="majorHAnsi" w:hAnsiTheme="majorHAnsi" w:eastAsiaTheme="majorEastAsia" w:cstheme="majorBidi"/>
@@ -14140,6 +14241,7 @@
     <w:name w:val="Intense Quote Char"/>
     <w:basedOn w:val="132"/>
     <w:link w:val="156"/>
+    <w:qFormat/>
     <w:uiPriority w:val="30"/>
     <w:rPr>
       <w:b/>

</xml_diff>

<commit_message>
chore: archive current in-progress changes\n\n🤖 Generated with [Claude Code](https://claude.ai/code)\n\nCo-Authored-By: Claude <noreply@anthropic.com>
</commit_message>
<xml_diff>
--- a/CodeKids_Enterprise_平台介绍与技术架构完整版.docx
+++ b/CodeKids_Enterprise_平台介绍与技术架构完整版.docx
@@ -10,6 +10,7 @@
         <w:t>CodeKids Enterprise · 平台介绍与技术架构（中国大陆AI接入正式版）</w:t>
       </w:r>
     </w:p>
+    <w:p/>
     <w:p>
       <w:pPr>
         <w:pStyle w:val="4"/>
@@ -99,8 +100,6 @@
           <w:lang w:val="en-US" w:eastAsia="zh-CN"/>
         </w:rPr>
       </w:pPr>
-      <w:bookmarkStart w:id="0" w:name="_GoBack"/>
-      <w:bookmarkEnd w:id="0"/>
       <w:r>
         <w:rPr>
           <w:rFonts w:hint="eastAsia" w:eastAsia="宋体"/>
@@ -110,13 +109,143 @@
       </w:r>
     </w:p>
     <w:p>
-      <w:r>
+      <w:pPr>
         <w:rPr>
           <w:rFonts w:hint="eastAsia" w:eastAsia="宋体"/>
           <w:lang w:val="en-US" w:eastAsia="zh-CN"/>
         </w:rPr>
+      </w:pPr>
+      <w:r>
+        <w:rPr>
+          <w:rFonts w:hint="eastAsia" w:eastAsia="宋体"/>
+          <w:lang w:val="en-US" w:eastAsia="zh-CN"/>
+        </w:rPr>
         <w:t>- 自定义头像</w:t>
       </w:r>
+    </w:p>
+    <w:p>
+      <w:pPr>
+        <w:rPr>
+          <w:rFonts w:hint="eastAsia" w:eastAsia="宋体"/>
+          <w:lang w:val="en-US" w:eastAsia="zh-CN"/>
+        </w:rPr>
+      </w:pPr>
+    </w:p>
+    <w:p>
+      <w:pPr>
+        <w:pStyle w:val="30"/>
+        <w:keepNext w:val="0"/>
+        <w:keepLines w:val="0"/>
+        <w:widowControl/>
+        <w:suppressLineNumbers w:val="0"/>
+        <w:ind w:right="720"/>
+      </w:pPr>
+      <w:r>
+        <w:rPr>
+          <w:rStyle w:val="134"/>
+          <w:rFonts w:hint="eastAsia" w:ascii="宋体" w:hAnsi="宋体" w:eastAsia="宋体" w:cs="宋体"/>
+          <w:sz w:val="24"/>
+          <w:szCs w:val="24"/>
+        </w:rPr>
+        <w:t>MVP 范围声明（两个月内上线）</w:t>
+      </w:r>
+      <w:r>
+        <w:rPr>
+          <w:rFonts w:hint="eastAsia" w:ascii="宋体" w:hAnsi="宋体" w:eastAsia="宋体" w:cs="宋体"/>
+          <w:sz w:val="24"/>
+          <w:szCs w:val="24"/>
+        </w:rPr>
+        <w:t>：本阶段聚焦“登录/注册、微信支付、编辑器与可视化、课程上传</w:t>
+      </w:r>
+      <w:r>
+        <w:rPr>
+          <w:rFonts w:hint="eastAsia" w:ascii="宋体" w:hAnsi="宋体" w:eastAsia="宋体" w:cs="宋体"/>
+          <w:sz w:val="24"/>
+          <w:szCs w:val="24"/>
+          <w:lang w:eastAsia="zh-CN"/>
+        </w:rPr>
+        <w:t>（</w:t>
+      </w:r>
+      <w:r>
+        <w:rPr>
+          <w:rFonts w:hint="eastAsia" w:ascii="宋体" w:hAnsi="宋体" w:eastAsia="宋体" w:cs="宋体"/>
+          <w:sz w:val="24"/>
+          <w:szCs w:val="24"/>
+          <w:lang w:val="en-US" w:eastAsia="zh-CN"/>
+        </w:rPr>
+        <w:t>三种模式，隐藏课程代码（类似codemonkey学生使用写好的函数进行编程），隐藏上下代码，学生补全中间，自由创作</w:t>
+      </w:r>
+      <w:r>
+        <w:rPr>
+          <w:rFonts w:hint="eastAsia" w:ascii="宋体" w:hAnsi="宋体" w:eastAsia="宋体" w:cs="宋体"/>
+          <w:sz w:val="24"/>
+          <w:szCs w:val="24"/>
+          <w:lang w:eastAsia="zh-CN"/>
+        </w:rPr>
+        <w:t>）</w:t>
+      </w:r>
+      <w:r>
+        <w:rPr>
+          <w:rFonts w:hint="eastAsia" w:ascii="宋体" w:hAnsi="宋体" w:eastAsia="宋体" w:cs="宋体"/>
+          <w:sz w:val="24"/>
+          <w:szCs w:val="24"/>
+        </w:rPr>
+        <w:t>与学习</w:t>
+      </w:r>
+      <w:r>
+        <w:rPr>
+          <w:rFonts w:hint="eastAsia" w:ascii="宋体" w:hAnsi="宋体" w:eastAsia="宋体" w:cs="宋体"/>
+          <w:sz w:val="24"/>
+          <w:szCs w:val="24"/>
+          <w:lang w:eastAsia="zh-CN"/>
+        </w:rPr>
+        <w:t>（</w:t>
+      </w:r>
+      <w:r>
+        <w:rPr>
+          <w:rFonts w:hint="eastAsia" w:ascii="宋体" w:hAnsi="宋体" w:eastAsia="宋体" w:cs="宋体"/>
+          <w:sz w:val="24"/>
+          <w:szCs w:val="24"/>
+          <w:lang w:val="en-US" w:eastAsia="zh-CN"/>
+        </w:rPr>
+        <w:t>含视频，ppt，图片</w:t>
+      </w:r>
+      <w:r>
+        <w:rPr>
+          <w:rFonts w:hint="eastAsia" w:ascii="宋体" w:hAnsi="宋体" w:eastAsia="宋体" w:cs="宋体"/>
+          <w:sz w:val="24"/>
+          <w:szCs w:val="24"/>
+          <w:lang w:eastAsia="zh-CN"/>
+        </w:rPr>
+        <w:t>）</w:t>
+      </w:r>
+      <w:r>
+        <w:rPr>
+          <w:rFonts w:hint="eastAsia" w:ascii="宋体" w:hAnsi="宋体" w:eastAsia="宋体" w:cs="宋体"/>
+          <w:sz w:val="24"/>
+          <w:szCs w:val="24"/>
+        </w:rPr>
+        <w:t>、AI 助手（报错解释/翻译/示例建议）”。</w:t>
+      </w:r>
+      <w:r>
+        <w:rPr>
+          <w:rStyle w:val="134"/>
+          <w:rFonts w:hint="eastAsia" w:ascii="宋体" w:hAnsi="宋体" w:eastAsia="宋体" w:cs="宋体"/>
+          <w:sz w:val="24"/>
+          <w:szCs w:val="24"/>
+        </w:rPr>
+        <w:t>PK、天气/生态、成就商城、家长观战等延后</w:t>
+      </w:r>
+      <w:r>
+        <w:rPr>
+          <w:rFonts w:hint="eastAsia" w:ascii="宋体" w:hAnsi="宋体" w:eastAsia="宋体" w:cs="宋体"/>
+          <w:sz w:val="24"/>
+          <w:szCs w:val="24"/>
+        </w:rPr>
+        <w:t>到后续版本渐进发布。</w:t>
+      </w:r>
+    </w:p>
+    <w:p>
       <w:r>
         <w:br w:type="textWrapping"/>
       </w:r>
@@ -144,7 +273,7 @@
     </w:p>
     <w:tbl>
       <w:tblPr>
-        <w:tblStyle w:val="32"/>
+        <w:tblStyle w:val="33"/>
         <w:tblW w:w="0" w:type="auto"/>
         <w:tblInd w:w="0" w:type="dxa"/>
         <w:tblLayout w:type="autofit"/>
@@ -652,6 +781,109 @@
     </w:p>
     <w:p>
       <w:pPr>
+        <w:rPr>
+          <w:rFonts w:ascii="宋体" w:hAnsi="宋体" w:eastAsia="宋体" w:cs="宋体"/>
+          <w:sz w:val="24"/>
+          <w:szCs w:val="24"/>
+        </w:rPr>
+      </w:pPr>
+      <w:r>
+        <w:rPr>
+          <w:rStyle w:val="134"/>
+          <w:rFonts w:ascii="宋体" w:hAnsi="宋体" w:eastAsia="宋体" w:cs="宋体"/>
+          <w:sz w:val="24"/>
+          <w:szCs w:val="24"/>
+        </w:rPr>
+        <w:t>协作与回退（MVP）</w:t>
+      </w:r>
+      <w:r>
+        <w:rPr>
+          <w:rFonts w:ascii="宋体" w:hAnsi="宋体" w:eastAsia="宋体" w:cs="宋体"/>
+          <w:sz w:val="24"/>
+          <w:szCs w:val="24"/>
+        </w:rPr>
+        <w:t>：先</w:t>
+      </w:r>
+      <w:r>
+        <w:rPr>
+          <w:rStyle w:val="134"/>
+          <w:rFonts w:ascii="宋体" w:hAnsi="宋体" w:eastAsia="宋体" w:cs="宋体"/>
+          <w:sz w:val="24"/>
+          <w:szCs w:val="24"/>
+        </w:rPr>
+        <w:t>单人稳</w:t>
+      </w:r>
+      <w:r>
+        <w:rPr>
+          <w:rFonts w:ascii="宋体" w:hAnsi="宋体" w:eastAsia="宋体" w:cs="宋体"/>
+          <w:sz w:val="24"/>
+          <w:szCs w:val="24"/>
+        </w:rPr>
+        <w:t>，第1期提供</w:t>
+      </w:r>
+      <w:r>
+        <w:rPr>
+          <w:rStyle w:val="134"/>
+          <w:rFonts w:ascii="宋体" w:hAnsi="宋体" w:eastAsia="宋体" w:cs="宋体"/>
+          <w:sz w:val="24"/>
+          <w:szCs w:val="24"/>
+        </w:rPr>
+        <w:t>快照与版本回退</w:t>
+      </w:r>
+      <w:r>
+        <w:rPr>
+          <w:rFonts w:ascii="宋体" w:hAnsi="宋体" w:eastAsia="宋体" w:cs="宋体"/>
+          <w:sz w:val="24"/>
+          <w:szCs w:val="24"/>
+        </w:rPr>
+        <w:t>；多人协作</w:t>
+      </w:r>
+      <w:r>
+        <w:rPr>
+          <w:rStyle w:val="134"/>
+          <w:rFonts w:ascii="宋体" w:hAnsi="宋体" w:eastAsia="宋体" w:cs="宋体"/>
+          <w:sz w:val="24"/>
+          <w:szCs w:val="24"/>
+        </w:rPr>
+        <w:t>灰度开启</w:t>
+      </w:r>
+      <w:r>
+        <w:rPr>
+          <w:rFonts w:ascii="宋体" w:hAnsi="宋体" w:eastAsia="宋体" w:cs="宋体"/>
+          <w:sz w:val="24"/>
+          <w:szCs w:val="24"/>
+        </w:rPr>
+        <w:t xml:space="preserve">，由 </w:t>
+      </w:r>
+      <w:r>
+        <w:rPr>
+          <w:rStyle w:val="134"/>
+          <w:rFonts w:ascii="宋体" w:hAnsi="宋体" w:eastAsia="宋体" w:cs="宋体"/>
+          <w:sz w:val="24"/>
+          <w:szCs w:val="24"/>
+        </w:rPr>
+        <w:t>Yjs</w:t>
+      </w:r>
+      <w:r>
+        <w:rPr>
+          <w:rFonts w:ascii="宋体" w:hAnsi="宋体" w:eastAsia="宋体" w:cs="宋体"/>
+          <w:sz w:val="24"/>
+          <w:szCs w:val="24"/>
+        </w:rPr>
+        <w:t xml:space="preserve"> 处理合并与撤销。</w:t>
+      </w:r>
+    </w:p>
+    <w:p>
+      <w:pPr>
+        <w:rPr>
+          <w:rFonts w:ascii="宋体" w:hAnsi="宋体" w:eastAsia="宋体" w:cs="宋体"/>
+          <w:sz w:val="24"/>
+          <w:szCs w:val="24"/>
+        </w:rPr>
+      </w:pPr>
+    </w:p>
+    <w:p>
+      <w:pPr>
         <w:pStyle w:val="4"/>
       </w:pPr>
       <w:r>
@@ -892,253 +1124,1687 @@
         <w:t>- 鼠标悬停提示错误 → 点击一键修复为英文符号。</w:t>
       </w:r>
     </w:p>
-    <w:p>
-      <w:pPr>
-        <w:rPr>
-          <w:rFonts w:hint="eastAsia"/>
-        </w:rPr>
-      </w:pPr>
-      <w:r>
-        <w:rPr>
-          <w:rFonts w:hint="eastAsia"/>
-        </w:rPr>
-        <w:t>八、平台技术架构（中国大陆AI接入）</w:t>
-      </w:r>
-    </w:p>
-    <w:p>
-      <w:pPr>
-        <w:rPr>
-          <w:rFonts w:hint="eastAsia"/>
-        </w:rPr>
-      </w:pPr>
-      <w:r>
-        <w:rPr>
-          <w:rFonts w:hint="eastAsia"/>
-        </w:rPr>
-        <w:t>1️⃣ 前端技术栈：React + TypeScript + Vite + Tailwind CSS + Zustand + Framer Motion + Lottie + Monaco Editor + Socket.IO Client + ReactPlayer + PDF.js + 微信小程序 / H5。</w:t>
-      </w:r>
-    </w:p>
-    <w:p>
-      <w:pPr>
-        <w:rPr>
-          <w:rFonts w:hint="eastAsia"/>
-        </w:rPr>
-      </w:pPr>
-      <w:r>
-        <w:rPr>
-          <w:rFonts w:hint="eastAsia"/>
-        </w:rPr>
-        <w:t>支持多人协作、断线重连、荣耀协作、中文符号修复、英语辅助。</w:t>
-      </w:r>
-    </w:p>
-    <w:p>
-      <w:pPr>
-        <w:rPr>
-          <w:rFonts w:hint="eastAsia"/>
-        </w:rPr>
-      </w:pPr>
-      <w:r>
-        <w:rPr>
-          <w:rFonts w:hint="eastAsia"/>
-        </w:rPr>
-        <w:t>2️⃣ 后端技术栈：Java + Spring Boot + Netty + Socket.IO Java Client + Flask + Flask-SocketIO + FastAPI + Celery + Redis + RabbitMQ + Docker + Kubernetes。</w:t>
-      </w:r>
-    </w:p>
-    <w:p>
-      <w:pPr>
-        <w:rPr>
-          <w:rFonts w:hint="eastAsia"/>
-        </w:rPr>
-      </w:pPr>
-      <w:r>
-        <w:rPr>
-          <w:rFonts w:hint="eastAsia"/>
-        </w:rPr>
-        <w:t>支持WebSocket双工通信、协作Room管理、事件广播、AI微服务（接入通义千问、文心一言、星火认知）、金币交易、成就系统。</w:t>
-      </w:r>
-    </w:p>
-    <w:p>
-      <w:pPr>
-        <w:rPr>
-          <w:rFonts w:hint="eastAsia"/>
-        </w:rPr>
-      </w:pPr>
-      <w:r>
-        <w:rPr>
-          <w:rFonts w:hint="eastAsia"/>
-        </w:rPr>
-        <w:t>3️⃣ 数据存储：MySQL + MongoDB + MinIO + Redis。</w:t>
-      </w:r>
-    </w:p>
-    <w:p>
-      <w:pPr>
-        <w:rPr>
-          <w:rFonts w:hint="eastAsia"/>
-        </w:rPr>
-      </w:pPr>
-      <w:r>
-        <w:rPr>
-          <w:rFonts w:hint="eastAsia"/>
-        </w:rPr>
-        <w:t>4️⃣ 网络与部署：Nginx + Kong + Kubernetes + Argo Rollouts + RedisInsight + RabbitMQ管理 + Prometheus + Grafana + Loki + CDN。</w:t>
-      </w:r>
-    </w:p>
-    <w:p>
-      <w:pPr>
-        <w:rPr>
-          <w:rFonts w:hint="eastAsia"/>
-        </w:rPr>
-      </w:pPr>
-      <w:r>
-        <w:rPr>
-          <w:rFonts w:hint="eastAsia"/>
-        </w:rPr>
-        <w:t>5️⃣ AI智能模块：文本与代码（通义千问、文心一言、星火认知），语音（科大讯飞TTS、腾讯云TTS），支持翻译、报错解释、自动修复、代码补全、任务推荐。</w:t>
-      </w:r>
-    </w:p>
-    <w:p>
-      <w:pPr>
-        <w:rPr>
-          <w:rFonts w:hint="eastAsia"/>
-        </w:rPr>
-      </w:pPr>
-      <w:r>
-        <w:rPr>
-          <w:rFonts w:hint="eastAsia"/>
-        </w:rPr>
-        <w:t>6️⃣ 安全与高可用保障（重点强化）：</w:t>
-      </w:r>
-    </w:p>
-    <w:p>
-      <w:pPr>
-        <w:rPr>
-          <w:rFonts w:hint="eastAsia"/>
-        </w:rPr>
-      </w:pPr>
-      <w:r>
-        <w:rPr>
-          <w:rFonts w:hint="eastAsia"/>
-        </w:rPr>
-        <w:t>限流与防刷：IP限流 / 用户限流 / API限流 / WebSocket限流。</w:t>
-      </w:r>
-    </w:p>
-    <w:p>
-      <w:pPr>
-        <w:rPr>
-          <w:rFonts w:hint="eastAsia"/>
-        </w:rPr>
-      </w:pPr>
-      <w:r>
-        <w:rPr>
-          <w:rFonts w:hint="eastAsia"/>
-        </w:rPr>
-        <w:t>灰度发布与金丝雀部署：Kubernetes + Argo Rollouts 流量分级，异常回滚。</w:t>
-      </w:r>
-    </w:p>
-    <w:p>
-      <w:pPr>
-        <w:rPr>
-          <w:rFonts w:hint="eastAsia"/>
-        </w:rPr>
-      </w:pPr>
-      <w:r>
-        <w:rPr>
-          <w:rFonts w:hint="eastAsia"/>
-        </w:rPr>
-        <w:t>流量熔断：超载熔断，Redis保护、RabbitMQ队列防爆。</w:t>
-      </w:r>
-    </w:p>
-    <w:p>
-      <w:pPr>
-        <w:rPr>
-          <w:rFonts w:hint="eastAsia"/>
-        </w:rPr>
-      </w:pPr>
-      <w:r>
-        <w:rPr>
-          <w:rFonts w:hint="eastAsia"/>
-        </w:rPr>
-        <w:t>数据防篡改：MinIO对象存储 + 数据快照 + 多地容灾。</w:t>
-      </w:r>
-    </w:p>
-    <w:p>
-      <w:pPr>
-        <w:rPr>
-          <w:rFonts w:hint="eastAsia"/>
-        </w:rPr>
-      </w:pPr>
-      <w:r>
-        <w:rPr>
-          <w:rFonts w:hint="eastAsia"/>
-        </w:rPr>
-        <w:t>API安全：JWT + OAuth + 防重放 + 请求签名 + 时间戳。</w:t>
-      </w:r>
-    </w:p>
-    <w:p>
-      <w:pPr>
-        <w:rPr>
-          <w:rFonts w:hint="eastAsia"/>
-        </w:rPr>
-      </w:pPr>
-      <w:r>
-        <w:rPr>
-          <w:rFonts w:hint="eastAsia"/>
-        </w:rPr>
-        <w:t>金币与交易保护：分布式事务，ACID日志，防止交易异常。</w:t>
-      </w:r>
-    </w:p>
-    <w:p>
-      <w:pPr>
-        <w:rPr>
-          <w:rFonts w:hint="eastAsia"/>
-        </w:rPr>
-      </w:pPr>
-      <w:r>
-        <w:rPr>
-          <w:rFonts w:hint="eastAsia"/>
-        </w:rPr>
-        <w:t>数据一致性：Redis状态持久 + MySQL事务 + Mongo日志回溯。</w:t>
-      </w:r>
-    </w:p>
-    <w:p>
-      <w:pPr>
-        <w:rPr>
-          <w:rFonts w:hint="eastAsia"/>
-        </w:rPr>
-      </w:pPr>
-      <w:r>
-        <w:rPr>
-          <w:rFonts w:hint="eastAsia"/>
-        </w:rPr>
-        <w:t>DDoS防护：CDN + Nginx + Kong 多层防护。</w:t>
-      </w:r>
-    </w:p>
-    <w:p>
-      <w:pPr>
-        <w:rPr>
-          <w:rFonts w:hint="eastAsia"/>
-        </w:rPr>
-      </w:pPr>
-      <w:r>
-        <w:rPr>
-          <w:rFonts w:hint="eastAsia"/>
-        </w:rPr>
-        <w:t>日志与监控：Loki + Prometheus + Grafana + Sentry。</w:t>
-      </w:r>
-    </w:p>
-    <w:p>
-      <w:pPr>
-        <w:rPr>
-          <w:rFonts w:hint="eastAsia"/>
-        </w:rPr>
-      </w:pPr>
-      <w:r>
-        <w:rPr>
-          <w:rFonts w:hint="eastAsia"/>
-        </w:rPr>
-        <w:t>安全告警：邮件 / 钉钉 / 飞书 → 实时异常 + 性能预警。</w:t>
-      </w:r>
-    </w:p>
+    <w:p/>
+    <w:p/>
+    <w:p>
+      <w:pPr>
+        <w:rPr>
+          <w:rFonts w:hint="eastAsia"/>
+        </w:rPr>
+      </w:pPr>
+      <w:r>
+        <w:rPr>
+          <w:rFonts w:hint="eastAsia"/>
+        </w:rPr>
+        <w:t>八、平台技术架构（中国大陆 AI 接入 · MVP 版）</w:t>
+      </w:r>
+      <w:r>
+        <w:br w:type="textWrapping"/>
+      </w:r>
+      <w:r>
+        <w:br w:type="textWrapping"/>
+      </w:r>
+      <w:r>
+        <w:rPr>
+          <w:rFonts w:hint="eastAsia"/>
+        </w:rPr>
+        <w:t>1️⃣ 前端技术栈（单通道优先 · 协作灰度）</w:t>
+      </w:r>
+      <w:r>
+        <w:rPr>
+          <w:rFonts w:hint="default"/>
+        </w:rPr>
+        <w:t xml:space="preserve"> </w:t>
+      </w:r>
+    </w:p>
+    <w:p>
+      <w:pPr>
+        <w:rPr>
+          <w:rFonts w:hint="eastAsia"/>
+        </w:rPr>
+      </w:pPr>
+      <w:r>
+        <w:rPr>
+          <w:rFonts w:hint="eastAsia"/>
+        </w:rPr>
+        <w:t>React + TypeScript + Vite + Tailwind CSS + Zustand + Framer Motion + Lottie + Monaco Editor + 原生 WebSocket（单业务通道）+ 自定义 Yjs Provider（同路复用）/ y-websocket（灰度） + ReactPlayer + PDF.js + 微信小程序 / H5</w:t>
+      </w:r>
+    </w:p>
+    <w:p>
+      <w:pPr>
+        <w:rPr>
+          <w:rFonts w:hint="eastAsia"/>
+        </w:rPr>
+      </w:pPr>
+    </w:p>
+    <w:p>
+      <w:pPr>
+        <w:rPr>
+          <w:rFonts w:hint="eastAsia"/>
+        </w:rPr>
+      </w:pPr>
+      <w:r>
+        <w:rPr>
+          <w:rFonts w:hint="eastAsia"/>
+        </w:rPr>
+        <w:t>仅一条业务 WS（除 HMR 外）。协作默认同路复用：自定义 Yjs Provider 将协作更新封装为 topic=collab.* 的消息；</w:t>
+      </w:r>
+    </w:p>
+    <w:p>
+      <w:pPr>
+        <w:rPr>
+          <w:rFonts w:hint="eastAsia"/>
+        </w:rPr>
+      </w:pPr>
+      <w:r>
+        <w:rPr>
+          <w:rFonts w:hint="eastAsia"/>
+        </w:rPr>
+        <w:t>灰度开关：必要时启用第二条 y-websocket 专线（仅协作），不影响“单业务 WS”SLO统计。</w:t>
+      </w:r>
+    </w:p>
+    <w:p>
+      <w:pPr>
+        <w:rPr>
+          <w:rFonts w:hint="eastAsia"/>
+        </w:rPr>
+      </w:pPr>
+    </w:p>
+    <w:p>
+      <w:pPr>
+        <w:rPr>
+          <w:rFonts w:hint="eastAsia"/>
+        </w:rPr>
+      </w:pPr>
+      <w:r>
+        <w:rPr>
+          <w:rFonts w:hint="eastAsia"/>
+        </w:rPr>
+        <w:t>可视化窗口：固定宽高比、无拉伸；前端按固定时间步长渲染，支持“帧丢弃优先于排队”的策略，避免积压卡顿。</w:t>
+      </w:r>
+    </w:p>
+    <w:p>
+      <w:pPr>
+        <w:rPr>
+          <w:rFonts w:hint="eastAsia"/>
+        </w:rPr>
+      </w:pPr>
+    </w:p>
+    <w:p>
+      <w:pPr>
+        <w:rPr>
+          <w:rFonts w:hint="eastAsia"/>
+        </w:rPr>
+      </w:pPr>
+      <w:r>
+        <w:rPr>
+          <w:rFonts w:hint="eastAsia"/>
+        </w:rPr>
+        <w:t>输入增强：中文符号检测与一键修复；报错翻译/朗读；Lint 与英语术语提示。</w:t>
+      </w:r>
+    </w:p>
+    <w:p>
+      <w:pPr>
+        <w:rPr>
+          <w:rFonts w:hint="eastAsia"/>
+        </w:rPr>
+      </w:pPr>
+    </w:p>
+    <w:p>
+      <w:pPr>
+        <w:rPr>
+          <w:rFonts w:hint="eastAsia"/>
+        </w:rPr>
+      </w:pPr>
+      <w:r>
+        <w:rPr>
+          <w:rFonts w:hint="eastAsia"/>
+        </w:rPr>
+        <w:t>版本回退：保存点生成“缩略图+说明”，与后端快照对齐（见 §3）。</w:t>
+      </w:r>
+    </w:p>
+    <w:p>
+      <w:pPr>
+        <w:rPr>
+          <w:rFonts w:hint="eastAsia"/>
+        </w:rPr>
+      </w:pPr>
+    </w:p>
+    <w:p>
+      <w:pPr>
+        <w:rPr>
+          <w:rFonts w:hint="eastAsia"/>
+        </w:rPr>
+      </w:pPr>
+      <w:r>
+        <w:rPr>
+          <w:rFonts w:hint="eastAsia"/>
+        </w:rPr>
+        <w:t>长回复流式：AI 输出统一分片协议，前端按序拼接；编辑器不阻塞。</w:t>
+      </w:r>
+    </w:p>
+    <w:p>
+      <w:pPr>
+        <w:rPr>
+          <w:rFonts w:hint="eastAsia"/>
+        </w:rPr>
+      </w:pPr>
+    </w:p>
+    <w:p>
+      <w:pPr>
+        <w:rPr>
+          <w:rFonts w:hint="eastAsia"/>
+        </w:rPr>
+      </w:pPr>
+      <w:r>
+        <w:rPr>
+          <w:rFonts w:hint="eastAsia"/>
+        </w:rPr>
+        <w:t>2️⃣ 后端技术栈（统一栈+清晰职责）</w:t>
+      </w:r>
+    </w:p>
+    <w:p>
+      <w:pPr>
+        <w:rPr>
+          <w:rFonts w:hint="eastAsia"/>
+        </w:rPr>
+      </w:pPr>
+    </w:p>
+    <w:p>
+      <w:pPr>
+        <w:rPr>
+          <w:rFonts w:hint="eastAsia"/>
+        </w:rPr>
+      </w:pPr>
+      <w:r>
+        <w:rPr>
+          <w:rFonts w:hint="eastAsia"/>
+        </w:rPr>
+        <w:t>Java（Spring Boot + WebFlux / Reactor Netty 网关） + FastAPI（HTTP 微服务） + Celery（任务队列） + Redis + RabbitMQ + Docker + Kubernetes</w:t>
+      </w:r>
+    </w:p>
+    <w:p>
+      <w:pPr>
+        <w:rPr>
+          <w:rFonts w:hint="eastAsia"/>
+        </w:rPr>
+      </w:pPr>
+    </w:p>
+    <w:p>
+      <w:pPr>
+        <w:rPr>
+          <w:rFonts w:hint="eastAsia"/>
+        </w:rPr>
+      </w:pPr>
+      <w:r>
+        <w:rPr>
+          <w:rFonts w:hint="eastAsia"/>
+        </w:rPr>
+        <w:t>对外统一网关：WebFlux（Reactor Netty）承载原生 WS、鉴权、粘性会话、一致性哈希分发、背压与限流。</w:t>
+      </w:r>
+    </w:p>
+    <w:p>
+      <w:pPr>
+        <w:rPr>
+          <w:rFonts w:hint="eastAsia"/>
+        </w:rPr>
+      </w:pPr>
+    </w:p>
+    <w:p>
+      <w:pPr>
+        <w:rPr>
+          <w:rFonts w:hint="eastAsia"/>
+        </w:rPr>
+      </w:pPr>
+      <w:r>
+        <w:rPr>
+          <w:rFonts w:hint="eastAsia"/>
+        </w:rPr>
+        <w:t>微服务统一：HTTP 全用 FastAPI；如需 Socket.IO 生态，仅作为后端内部侧边车，不对外暴露。</w:t>
+      </w:r>
+    </w:p>
+    <w:p>
+      <w:pPr>
+        <w:rPr>
+          <w:rFonts w:hint="eastAsia"/>
+        </w:rPr>
+      </w:pPr>
+    </w:p>
+    <w:p>
+      <w:pPr>
+        <w:rPr>
+          <w:rFonts w:hint="eastAsia"/>
+        </w:rPr>
+      </w:pPr>
+      <w:r>
+        <w:rPr>
+          <w:rFonts w:hint="eastAsia"/>
+        </w:rPr>
+        <w:t>可靠广播：业务事件（公告/房间消息/PK状态）用 RabbitMQ topic/fanout；</w:t>
+      </w:r>
+    </w:p>
+    <w:p>
+      <w:pPr>
+        <w:rPr>
+          <w:rFonts w:hint="eastAsia"/>
+        </w:rPr>
+      </w:pPr>
+      <w:r>
+        <w:rPr>
+          <w:rFonts w:hint="eastAsia"/>
+        </w:rPr>
+        <w:t>Presence/路由用 Redis（短状态+TTL），不以 Redis Pub/Sub 充当可靠总线。</w:t>
+      </w:r>
+    </w:p>
+    <w:p>
+      <w:pPr>
+        <w:rPr>
+          <w:rFonts w:hint="eastAsia"/>
+        </w:rPr>
+      </w:pPr>
+    </w:p>
+    <w:p>
+      <w:pPr>
+        <w:rPr>
+          <w:rFonts w:hint="eastAsia"/>
+        </w:rPr>
+      </w:pPr>
+      <w:r>
+        <w:rPr>
+          <w:rFonts w:hint="eastAsia"/>
+        </w:rPr>
+        <w:t>AI Router：统一接通义/文心/星火（MVP 先接一家），内建配额/QPS、熔断、降级与审计。</w:t>
+      </w:r>
+    </w:p>
+    <w:p>
+      <w:pPr>
+        <w:rPr>
+          <w:rFonts w:hint="eastAsia"/>
+        </w:rPr>
+      </w:pPr>
+    </w:p>
+    <w:p>
+      <w:pPr>
+        <w:rPr>
+          <w:rFonts w:hint="eastAsia"/>
+        </w:rPr>
+      </w:pPr>
+      <w:r>
+        <w:rPr>
+          <w:rFonts w:hint="eastAsia"/>
+        </w:rPr>
+        <w:t>3️⃣ 可视化执行链路（编辑器核心·Pygame 专段）</w:t>
+      </w:r>
+    </w:p>
+    <w:p>
+      <w:pPr>
+        <w:rPr>
+          <w:rFonts w:hint="eastAsia"/>
+        </w:rPr>
+      </w:pPr>
+    </w:p>
+    <w:p>
+      <w:pPr>
+        <w:rPr>
+          <w:rFonts w:hint="eastAsia"/>
+        </w:rPr>
+      </w:pPr>
+      <w:r>
+        <w:rPr>
+          <w:rFonts w:hint="eastAsia"/>
+        </w:rPr>
+        <w:t>服务组件：py-exec（FastAPI） + 隔离沙箱（Docker/namespace + seccomp + 资源限额） + Celery Worker</w:t>
+      </w:r>
+    </w:p>
+    <w:p>
+      <w:pPr>
+        <w:rPr>
+          <w:rFonts w:hint="eastAsia"/>
+        </w:rPr>
+      </w:pPr>
+      <w:r>
+        <w:rPr>
+          <w:rFonts w:hint="eastAsia"/>
+        </w:rPr>
+        <w:t>渲染方式：无头渲染（SDL_DUMMY/OSMesa）→ 帧采集（Surfaces）→ 编码 → WS 推送</w:t>
+      </w:r>
+    </w:p>
+    <w:p>
+      <w:pPr>
+        <w:rPr>
+          <w:rFonts w:hint="eastAsia"/>
+        </w:rPr>
+      </w:pPr>
+    </w:p>
+    <w:p>
+      <w:pPr>
+        <w:rPr>
+          <w:rFonts w:hint="eastAsia"/>
+        </w:rPr>
+      </w:pPr>
+      <w:r>
+        <w:rPr>
+          <w:rFonts w:hint="eastAsia"/>
+        </w:rPr>
+        <w:t>执行安全：每次运行在独立容器/进程内；默认禁网、限制 CPU/内存/文件系统；白名单模块。</w:t>
+      </w:r>
+    </w:p>
+    <w:p>
+      <w:pPr>
+        <w:rPr>
+          <w:rFonts w:hint="eastAsia"/>
+        </w:rPr>
+      </w:pPr>
+    </w:p>
+    <w:p>
+      <w:pPr>
+        <w:rPr>
+          <w:rFonts w:hint="eastAsia"/>
+        </w:rPr>
+      </w:pPr>
+      <w:r>
+        <w:rPr>
+          <w:rFonts w:hint="eastAsia"/>
+        </w:rPr>
+        <w:t>帧编码：</w:t>
+      </w:r>
+    </w:p>
+    <w:p>
+      <w:pPr>
+        <w:rPr>
+          <w:rFonts w:hint="eastAsia"/>
+        </w:rPr>
+      </w:pPr>
+    </w:p>
+    <w:p>
+      <w:pPr>
+        <w:rPr>
+          <w:rFonts w:hint="eastAsia"/>
+        </w:rPr>
+      </w:pPr>
+      <w:r>
+        <w:rPr>
+          <w:rFonts w:hint="eastAsia"/>
+        </w:rPr>
+        <w:t>MVP：关键帧 PNG + 差分帧（RLE/LZ4），上限 15–20 FPS；</w:t>
+      </w:r>
+    </w:p>
+    <w:p>
+      <w:pPr>
+        <w:rPr>
+          <w:rFonts w:hint="eastAsia"/>
+        </w:rPr>
+      </w:pPr>
+    </w:p>
+    <w:p>
+      <w:pPr>
+        <w:rPr>
+          <w:rFonts w:hint="eastAsia"/>
+        </w:rPr>
+      </w:pPr>
+      <w:r>
+        <w:rPr>
+          <w:rFonts w:hint="eastAsia"/>
+        </w:rPr>
+        <w:t>可选：MJPEG（简化）、后续再评估 H.264（复杂度更高，放 vNext）。</w:t>
+      </w:r>
+    </w:p>
+    <w:p>
+      <w:pPr>
+        <w:rPr>
+          <w:rFonts w:hint="eastAsia"/>
+        </w:rPr>
+      </w:pPr>
+    </w:p>
+    <w:p>
+      <w:pPr>
+        <w:rPr>
+          <w:rFonts w:hint="eastAsia"/>
+        </w:rPr>
+      </w:pPr>
+      <w:r>
+        <w:rPr>
+          <w:rFonts w:hint="eastAsia"/>
+        </w:rPr>
+        <w:t>消息主题：</w:t>
+      </w:r>
+    </w:p>
+    <w:p>
+      <w:pPr>
+        <w:rPr>
+          <w:rFonts w:hint="eastAsia"/>
+        </w:rPr>
+      </w:pPr>
+    </w:p>
+    <w:p>
+      <w:pPr>
+        <w:rPr>
+          <w:rFonts w:hint="eastAsia"/>
+        </w:rPr>
+      </w:pPr>
+      <w:r>
+        <w:rPr>
+          <w:rFonts w:hint="eastAsia"/>
+        </w:rPr>
+        <w:t>viz.frame（帧流，二进制）/ viz.event（键鼠事件上行）/ viz.ctrl（启动/暂停/重置）/ viz.meta（分辨率、FPS、统计）。</w:t>
+      </w:r>
+    </w:p>
+    <w:p>
+      <w:pPr>
+        <w:rPr>
+          <w:rFonts w:hint="eastAsia"/>
+        </w:rPr>
+      </w:pPr>
+    </w:p>
+    <w:p>
+      <w:pPr>
+        <w:rPr>
+          <w:rFonts w:hint="eastAsia"/>
+        </w:rPr>
+      </w:pPr>
+      <w:r>
+        <w:rPr>
+          <w:rFonts w:hint="eastAsia"/>
+        </w:rPr>
+        <w:t>背压：服务端对每连接 in-flight 窗口（如 32 帧）与全局令牌桶双限流；拥塞时优先丢弃最旧未处理帧。</w:t>
+      </w:r>
+    </w:p>
+    <w:p>
+      <w:pPr>
+        <w:rPr>
+          <w:rFonts w:hint="eastAsia"/>
+        </w:rPr>
+      </w:pPr>
+    </w:p>
+    <w:p>
+      <w:pPr>
+        <w:rPr>
+          <w:rFonts w:hint="eastAsia"/>
+        </w:rPr>
+      </w:pPr>
+      <w:r>
+        <w:rPr>
+          <w:rFonts w:hint="eastAsia"/>
+        </w:rPr>
+        <w:t>录制与回放：关键帧 + 差分索引写入 MinIO，元数据进 Mongo；编辑器“时光机”与“观战/复盘”共用一份数据。</w:t>
+      </w:r>
+    </w:p>
+    <w:p>
+      <w:pPr>
+        <w:rPr>
+          <w:rFonts w:hint="eastAsia"/>
+        </w:rPr>
+      </w:pPr>
+    </w:p>
+    <w:p>
+      <w:pPr>
+        <w:rPr>
+          <w:rFonts w:hint="eastAsia"/>
+        </w:rPr>
+      </w:pPr>
+      <w:r>
+        <w:rPr>
+          <w:rFonts w:hint="eastAsia"/>
+        </w:rPr>
+        <w:t>观战只读：弱网/家长观战走 SSE（只读帧/状态），避免双向信令带宽浪费。</w:t>
+      </w:r>
+    </w:p>
+    <w:p>
+      <w:pPr>
+        <w:rPr>
+          <w:rFonts w:hint="eastAsia"/>
+        </w:rPr>
+      </w:pPr>
+    </w:p>
+    <w:p>
+      <w:pPr>
+        <w:rPr>
+          <w:rFonts w:hint="eastAsia"/>
+        </w:rPr>
+      </w:pPr>
+      <w:r>
+        <w:rPr>
+          <w:rFonts w:hint="eastAsia"/>
+        </w:rPr>
+        <w:t>4️⃣ 数据存储（冷热分层+可回溯）</w:t>
+      </w:r>
+    </w:p>
+    <w:p>
+      <w:pPr>
+        <w:rPr>
+          <w:rFonts w:hint="eastAsia"/>
+        </w:rPr>
+      </w:pPr>
+    </w:p>
+    <w:p>
+      <w:pPr>
+        <w:rPr>
+          <w:rFonts w:hint="eastAsia"/>
+        </w:rPr>
+      </w:pPr>
+      <w:r>
+        <w:rPr>
+          <w:rFonts w:hint="eastAsia"/>
+        </w:rPr>
+        <w:t>MySQL（用户/订单/权限）+ MongoDB（课程/协作快照/可视化回放）+ MinIO（素材/导出工件/帧录像）+ Redis（会话目录/Presence/缓存）</w:t>
+      </w:r>
+    </w:p>
+    <w:p>
+      <w:pPr>
+        <w:rPr>
+          <w:rFonts w:hint="eastAsia"/>
+        </w:rPr>
+      </w:pPr>
+    </w:p>
+    <w:p>
+      <w:pPr>
+        <w:rPr>
+          <w:rFonts w:hint="eastAsia"/>
+        </w:rPr>
+      </w:pPr>
+      <w:r>
+        <w:rPr>
+          <w:rFonts w:hint="eastAsia"/>
+        </w:rPr>
+        <w:t>MySQL：InnoDB / READ COMMITTED；启用 Binlog；金币/支付链路采用幂等键 + Outbox（本地事务出箱 → MQ）。</w:t>
+      </w:r>
+    </w:p>
+    <w:p>
+      <w:pPr>
+        <w:rPr>
+          <w:rFonts w:hint="eastAsia"/>
+        </w:rPr>
+      </w:pPr>
+    </w:p>
+    <w:p>
+      <w:pPr>
+        <w:rPr>
+          <w:rFonts w:hint="eastAsia"/>
+        </w:rPr>
+      </w:pPr>
+      <w:r>
+        <w:rPr>
+          <w:rFonts w:hint="eastAsia"/>
+        </w:rPr>
+        <w:t>MongoDB：课程/作品采用“固定字段 + 扩展字段”；协作快照存增量 + 关键版本全量；回放索引与帧段指针入库。</w:t>
+      </w:r>
+    </w:p>
+    <w:p>
+      <w:pPr>
+        <w:rPr>
+          <w:rFonts w:hint="eastAsia"/>
+        </w:rPr>
+      </w:pPr>
+    </w:p>
+    <w:p>
+      <w:pPr>
+        <w:rPr>
+          <w:rFonts w:hint="eastAsia"/>
+        </w:rPr>
+      </w:pPr>
+      <w:r>
+        <w:rPr>
+          <w:rFonts w:hint="eastAsia"/>
+        </w:rPr>
+        <w:t>MinIO：开启版本控制/生命周期/纠删码；跨区异地容灾。</w:t>
+      </w:r>
+    </w:p>
+    <w:p>
+      <w:pPr>
+        <w:rPr>
+          <w:rFonts w:hint="eastAsia"/>
+        </w:rPr>
+      </w:pPr>
+    </w:p>
+    <w:p>
+      <w:pPr>
+        <w:rPr>
+          <w:rFonts w:hint="eastAsia"/>
+        </w:rPr>
+      </w:pPr>
+      <w:r>
+        <w:rPr>
+          <w:rFonts w:hint="eastAsia"/>
+        </w:rPr>
+        <w:t>Redis：presence:{room}:{uid} TTL 在线标记；房间成员集合与路由索引分离；禁止存储大消息体。</w:t>
+      </w:r>
+    </w:p>
+    <w:p>
+      <w:pPr>
+        <w:rPr>
+          <w:rFonts w:hint="eastAsia"/>
+        </w:rPr>
+      </w:pPr>
+    </w:p>
+    <w:p>
+      <w:pPr>
+        <w:rPr>
+          <w:rFonts w:hint="eastAsia"/>
+        </w:rPr>
+      </w:pPr>
+      <w:r>
+        <w:rPr>
+          <w:rFonts w:hint="eastAsia"/>
+        </w:rPr>
+        <w:t>5️⃣ 网络与部署（Kong 对外统一）</w:t>
+      </w:r>
+    </w:p>
+    <w:p>
+      <w:pPr>
+        <w:rPr>
+          <w:rFonts w:hint="eastAsia"/>
+        </w:rPr>
+      </w:pPr>
+    </w:p>
+    <w:p>
+      <w:pPr>
+        <w:rPr>
+          <w:rFonts w:hint="eastAsia"/>
+        </w:rPr>
+      </w:pPr>
+      <w:r>
+        <w:rPr>
+          <w:rFonts w:hint="eastAsia"/>
+        </w:rPr>
+        <w:t>Kong（Ingress/APIGW） + Kubernetes + Argo Rollouts + KEDA + Prometheus + Grafana + Loki + Tempo（OTel） + Sentry + CDN</w:t>
+      </w:r>
+    </w:p>
+    <w:p>
+      <w:pPr>
+        <w:rPr>
+          <w:rFonts w:hint="eastAsia"/>
+        </w:rPr>
+      </w:pPr>
+    </w:p>
+    <w:p>
+      <w:pPr>
+        <w:rPr>
+          <w:rFonts w:hint="eastAsia"/>
+        </w:rPr>
+      </w:pPr>
+      <w:r>
+        <w:rPr>
+          <w:rFonts w:hint="eastAsia"/>
+        </w:rPr>
+        <w:t>WebSocket 关键配置</w:t>
+      </w:r>
+    </w:p>
+    <w:p>
+      <w:pPr>
+        <w:rPr>
+          <w:rFonts w:hint="eastAsia"/>
+        </w:rPr>
+      </w:pPr>
+    </w:p>
+    <w:p>
+      <w:pPr>
+        <w:rPr>
+          <w:rFonts w:hint="eastAsia"/>
+        </w:rPr>
+      </w:pPr>
+      <w:r>
+        <w:rPr>
+          <w:rFonts w:hint="eastAsia"/>
+        </w:rPr>
+        <w:t>透传：Upgrade: websocket、Connection: upgrade</w:t>
+      </w:r>
+    </w:p>
+    <w:p>
+      <w:pPr>
+        <w:rPr>
+          <w:rFonts w:hint="eastAsia"/>
+        </w:rPr>
+      </w:pPr>
+    </w:p>
+    <w:p>
+      <w:pPr>
+        <w:rPr>
+          <w:rFonts w:hint="eastAsia"/>
+        </w:rPr>
+      </w:pPr>
+      <w:r>
+        <w:rPr>
+          <w:rFonts w:hint="eastAsia"/>
+        </w:rPr>
+        <w:t>粘性会话：基于 sessionId/uid 的一致性哈希（自定义头），避免重连漂移；</w:t>
+      </w:r>
+    </w:p>
+    <w:p>
+      <w:pPr>
+        <w:rPr>
+          <w:rFonts w:hint="eastAsia"/>
+        </w:rPr>
+      </w:pPr>
+    </w:p>
+    <w:p>
+      <w:pPr>
+        <w:rPr>
+          <w:rFonts w:hint="eastAsia"/>
+        </w:rPr>
+      </w:pPr>
+      <w:r>
+        <w:rPr>
+          <w:rFonts w:hint="eastAsia"/>
+        </w:rPr>
+        <w:t>限流与背压：按连接/主题令牌桶；设定 maxFrameSize；长流（AI/日志/帧）强制分片；</w:t>
+      </w:r>
+    </w:p>
+    <w:p>
+      <w:pPr>
+        <w:rPr>
+          <w:rFonts w:hint="eastAsia"/>
+        </w:rPr>
+      </w:pPr>
+    </w:p>
+    <w:p>
+      <w:pPr>
+        <w:rPr>
+          <w:rFonts w:hint="eastAsia"/>
+        </w:rPr>
+      </w:pPr>
+      <w:r>
+        <w:rPr>
+          <w:rFonts w:hint="eastAsia"/>
+        </w:rPr>
+        <w:t>压缩与保活：按需 permessage-deflate；心跳 20–30s；超时 60–90s；</w:t>
+      </w:r>
+    </w:p>
+    <w:p>
+      <w:pPr>
+        <w:rPr>
+          <w:rFonts w:hint="eastAsia"/>
+        </w:rPr>
+      </w:pPr>
+    </w:p>
+    <w:p>
+      <w:pPr>
+        <w:rPr>
+          <w:rFonts w:hint="eastAsia"/>
+        </w:rPr>
+      </w:pPr>
+      <w:r>
+        <w:rPr>
+          <w:rFonts w:hint="eastAsia"/>
+        </w:rPr>
+        <w:t>SSE 只读兜底：公告/观战/回放优先 SSE；写操作始终走 WS。</w:t>
+      </w:r>
+    </w:p>
+    <w:p>
+      <w:pPr>
+        <w:rPr>
+          <w:rFonts w:hint="eastAsia"/>
+        </w:rPr>
+      </w:pPr>
+    </w:p>
+    <w:p>
+      <w:pPr>
+        <w:rPr>
+          <w:rFonts w:hint="eastAsia"/>
+        </w:rPr>
+      </w:pPr>
+      <w:r>
+        <w:rPr>
+          <w:rFonts w:hint="eastAsia"/>
+        </w:rPr>
+        <w:t>对外仅暴露 Kong；如需内部静态加速可用内网 Nginx，不对外暴露。</w:t>
+      </w:r>
+    </w:p>
+    <w:p>
+      <w:pPr>
+        <w:rPr>
+          <w:rFonts w:hint="eastAsia"/>
+        </w:rPr>
+      </w:pPr>
+    </w:p>
+    <w:p>
+      <w:pPr>
+        <w:rPr>
+          <w:rFonts w:hint="eastAsia"/>
+        </w:rPr>
+      </w:pPr>
+      <w:r>
+        <w:rPr>
+          <w:rFonts w:hint="eastAsia"/>
+        </w:rPr>
+        <w:t>弹性与节点分池</w:t>
+      </w:r>
+    </w:p>
+    <w:p>
+      <w:pPr>
+        <w:rPr>
+          <w:rFonts w:hint="eastAsia"/>
+        </w:rPr>
+      </w:pPr>
+    </w:p>
+    <w:p>
+      <w:pPr>
+        <w:rPr>
+          <w:rFonts w:hint="eastAsia"/>
+        </w:rPr>
+      </w:pPr>
+      <w:r>
+        <w:rPr>
+          <w:rFonts w:hint="eastAsia"/>
+        </w:rPr>
+        <w:t>KEDA：基于 RabbitMQ 积压、Celery 活跃任务、WS 会话指标自动扩缩。</w:t>
+      </w:r>
+    </w:p>
+    <w:p>
+      <w:pPr>
+        <w:rPr>
+          <w:rFonts w:hint="eastAsia"/>
+        </w:rPr>
+      </w:pPr>
+    </w:p>
+    <w:p>
+      <w:pPr>
+        <w:rPr>
+          <w:rFonts w:hint="eastAsia"/>
+        </w:rPr>
+      </w:pPr>
+      <w:r>
+        <w:rPr>
+          <w:rFonts w:hint="eastAsia"/>
+        </w:rPr>
+        <w:t>节点池：ws-gateway 独立节点池（更高 ulimit/句柄/NIC），计算/存储分离。</w:t>
+      </w:r>
+    </w:p>
+    <w:p>
+      <w:pPr>
+        <w:rPr>
+          <w:rFonts w:hint="eastAsia"/>
+        </w:rPr>
+      </w:pPr>
+    </w:p>
+    <w:p>
+      <w:pPr>
+        <w:rPr>
+          <w:rFonts w:hint="eastAsia"/>
+        </w:rPr>
+      </w:pPr>
+      <w:r>
+        <w:rPr>
+          <w:rFonts w:hint="eastAsia"/>
+        </w:rPr>
+        <w:t>6️⃣ AI 智能模块（单入口·策略路由）</w:t>
+      </w:r>
+    </w:p>
+    <w:p>
+      <w:pPr>
+        <w:rPr>
+          <w:rFonts w:hint="eastAsia"/>
+        </w:rPr>
+      </w:pPr>
+    </w:p>
+    <w:p>
+      <w:pPr>
+        <w:rPr>
+          <w:rFonts w:hint="eastAsia"/>
+        </w:rPr>
+      </w:pPr>
+      <w:r>
+        <w:rPr>
+          <w:rFonts w:hint="eastAsia"/>
+        </w:rPr>
+        <w:t>文本/代码：通义千问 / 文心一言 / 星火（MVP 先接一家）；</w:t>
+      </w:r>
+    </w:p>
+    <w:p>
+      <w:pPr>
+        <w:rPr>
+          <w:rFonts w:hint="eastAsia"/>
+        </w:rPr>
+      </w:pPr>
+    </w:p>
+    <w:p>
+      <w:pPr>
+        <w:rPr>
+          <w:rFonts w:hint="eastAsia"/>
+        </w:rPr>
+      </w:pPr>
+      <w:r>
+        <w:rPr>
+          <w:rFonts w:hint="eastAsia"/>
+        </w:rPr>
+        <w:t>语音：科大讯飞 TTS / 腾讯云 TTS（择一优先）。</w:t>
+      </w:r>
+    </w:p>
+    <w:p>
+      <w:pPr>
+        <w:rPr>
+          <w:rFonts w:hint="eastAsia"/>
+        </w:rPr>
+      </w:pPr>
+    </w:p>
+    <w:p>
+      <w:pPr>
+        <w:rPr>
+          <w:rFonts w:hint="eastAsia"/>
+        </w:rPr>
+      </w:pPr>
+      <w:r>
+        <w:rPr>
+          <w:rFonts w:hint="eastAsia"/>
+        </w:rPr>
+        <w:t>AI Router：厂商路由、熔断、重试、配额/QPS、防雪崩；分片输出协议一致，编辑器无卡顿。</w:t>
+      </w:r>
+    </w:p>
+    <w:p>
+      <w:pPr>
+        <w:rPr>
+          <w:rFonts w:hint="eastAsia"/>
+        </w:rPr>
+      </w:pPr>
+    </w:p>
+    <w:p>
+      <w:pPr>
+        <w:rPr>
+          <w:rFonts w:hint="eastAsia"/>
+        </w:rPr>
+      </w:pPr>
+      <w:r>
+        <w:rPr>
+          <w:rFonts w:hint="eastAsia"/>
+        </w:rPr>
+        <w:t>内容合规：厂商内容安全 + 自研策略（关键词/规则），违规降级或打回。</w:t>
+      </w:r>
+    </w:p>
+    <w:p>
+      <w:pPr>
+        <w:rPr>
+          <w:rFonts w:hint="eastAsia"/>
+        </w:rPr>
+      </w:pPr>
+    </w:p>
+    <w:p>
+      <w:pPr>
+        <w:rPr>
+          <w:rFonts w:hint="eastAsia"/>
+        </w:rPr>
+      </w:pPr>
+      <w:r>
+        <w:rPr>
+          <w:rFonts w:hint="eastAsia"/>
+        </w:rPr>
+        <w:t>7️⃣ 安全与高可用（上线即位）</w:t>
+      </w:r>
+    </w:p>
+    <w:p>
+      <w:pPr>
+        <w:rPr>
+          <w:rFonts w:hint="eastAsia"/>
+        </w:rPr>
+      </w:pPr>
+    </w:p>
+    <w:p>
+      <w:pPr>
+        <w:rPr>
+          <w:rFonts w:hint="eastAsia"/>
+        </w:rPr>
+      </w:pPr>
+      <w:r>
+        <w:rPr>
+          <w:rFonts w:hint="eastAsia"/>
+        </w:rPr>
+        <w:t>限流与防刷：IP/用户/API/WS 多维限速；黑白名单与动态风控。</w:t>
+      </w:r>
+    </w:p>
+    <w:p>
+      <w:pPr>
+        <w:rPr>
+          <w:rFonts w:hint="eastAsia"/>
+        </w:rPr>
+      </w:pPr>
+    </w:p>
+    <w:p>
+      <w:pPr>
+        <w:rPr>
+          <w:rFonts w:hint="eastAsia"/>
+        </w:rPr>
+      </w:pPr>
+      <w:r>
+        <w:rPr>
+          <w:rFonts w:hint="eastAsia"/>
+        </w:rPr>
+        <w:t>灰度与回滚：Argo Rollouts（金丝雀 10%→30%→100%），探针覆盖建链率/RTT/关闭码 TopN/AI 成功率/帧延迟。</w:t>
+      </w:r>
+    </w:p>
+    <w:p>
+      <w:pPr>
+        <w:rPr>
+          <w:rFonts w:hint="eastAsia"/>
+        </w:rPr>
+      </w:pPr>
+    </w:p>
+    <w:p>
+      <w:pPr>
+        <w:rPr>
+          <w:rFonts w:hint="eastAsia"/>
+        </w:rPr>
+      </w:pPr>
+      <w:r>
+        <w:rPr>
+          <w:rFonts w:hint="eastAsia"/>
+        </w:rPr>
+        <w:t>熔断与隔离：AI &amp; 渲染通道独立熔断阈值；Redis 保护；RabbitMQ 死信与限速。</w:t>
+      </w:r>
+    </w:p>
+    <w:p>
+      <w:pPr>
+        <w:rPr>
+          <w:rFonts w:hint="eastAsia"/>
+        </w:rPr>
+      </w:pPr>
+    </w:p>
+    <w:p>
+      <w:pPr>
+        <w:rPr>
+          <w:rFonts w:hint="eastAsia"/>
+        </w:rPr>
+      </w:pPr>
+      <w:r>
+        <w:rPr>
+          <w:rFonts w:hint="eastAsia"/>
+        </w:rPr>
+        <w:t>数据安全：MinIO 周期快照；异地容灾；敏感字段加密。</w:t>
+      </w:r>
+    </w:p>
+    <w:p>
+      <w:pPr>
+        <w:rPr>
+          <w:rFonts w:hint="eastAsia"/>
+        </w:rPr>
+      </w:pPr>
+    </w:p>
+    <w:p>
+      <w:pPr>
+        <w:rPr>
+          <w:rFonts w:hint="eastAsia"/>
+        </w:rPr>
+      </w:pPr>
+      <w:r>
+        <w:rPr>
+          <w:rFonts w:hint="eastAsia"/>
+        </w:rPr>
+        <w:t>API 安全：JWT + OAuth；请求签名（appKey + nonce + ts + HMAC），5 分钟重放窗。</w:t>
+      </w:r>
+    </w:p>
+    <w:p>
+      <w:pPr>
+        <w:rPr>
+          <w:rFonts w:hint="eastAsia"/>
+        </w:rPr>
+      </w:pPr>
+    </w:p>
+    <w:p>
+      <w:pPr>
+        <w:rPr>
+          <w:rFonts w:hint="eastAsia"/>
+        </w:rPr>
+      </w:pPr>
+      <w:r>
+        <w:rPr>
+          <w:rFonts w:hint="eastAsia"/>
+        </w:rPr>
+        <w:t>交易保护：幂等键 + Outbox + 对账任务；失败仅前向补单。</w:t>
+      </w:r>
+    </w:p>
+    <w:p>
+      <w:pPr>
+        <w:rPr>
+          <w:rFonts w:hint="eastAsia"/>
+        </w:rPr>
+      </w:pPr>
+    </w:p>
+    <w:p>
+      <w:pPr>
+        <w:rPr>
+          <w:rFonts w:hint="eastAsia"/>
+        </w:rPr>
+      </w:pPr>
+      <w:r>
+        <w:rPr>
+          <w:rFonts w:hint="eastAsia"/>
+        </w:rPr>
+        <w:t>一致性：Redis 状态持久策略 + MySQL 事务 + Mongo 回溯三位一体。</w:t>
+      </w:r>
+    </w:p>
+    <w:p>
+      <w:pPr>
+        <w:rPr>
+          <w:rFonts w:hint="eastAsia"/>
+        </w:rPr>
+      </w:pPr>
+    </w:p>
+    <w:p>
+      <w:pPr>
+        <w:rPr>
+          <w:rFonts w:hint="eastAsia"/>
+        </w:rPr>
+      </w:pPr>
+      <w:r>
+        <w:rPr>
+          <w:rFonts w:hint="eastAsia"/>
+        </w:rPr>
+        <w:t>全链路追踪：OpenTelemetry → Tempo；前后端 Sentry 上报（采样可调）。</w:t>
+      </w:r>
+    </w:p>
+    <w:p>
+      <w:pPr>
+        <w:rPr>
+          <w:rFonts w:hint="eastAsia"/>
+        </w:rPr>
+      </w:pPr>
+    </w:p>
+    <w:p>
+      <w:pPr>
+        <w:rPr>
+          <w:rFonts w:hint="eastAsia"/>
+        </w:rPr>
+      </w:pPr>
+      <w:r>
+        <w:rPr>
+          <w:rFonts w:hint="eastAsia"/>
+        </w:rPr>
+        <w:t>8️⃣ WS 协议与可视化帧（V1 规范）</w:t>
+      </w:r>
+    </w:p>
+    <w:p>
+      <w:pPr>
+        <w:rPr>
+          <w:rFonts w:hint="eastAsia"/>
+        </w:rPr>
+      </w:pPr>
+    </w:p>
+    <w:p>
+      <w:pPr>
+        <w:rPr>
+          <w:rFonts w:hint="eastAsia"/>
+        </w:rPr>
+      </w:pPr>
+      <w:r>
+        <w:rPr>
+          <w:rFonts w:hint="eastAsia"/>
+        </w:rPr>
+        <w:t>通用信封：ver, sessionId, seq, topic, ts, payload, ackId?, traceId, win?, replaySince?, cmp?</w:t>
+      </w:r>
+    </w:p>
+    <w:p>
+      <w:pPr>
+        <w:rPr>
+          <w:rFonts w:hint="eastAsia"/>
+        </w:rPr>
+      </w:pPr>
+    </w:p>
+    <w:p>
+      <w:pPr>
+        <w:rPr>
+          <w:rFonts w:hint="eastAsia"/>
+        </w:rPr>
+      </w:pPr>
+      <w:r>
+        <w:rPr>
+          <w:rFonts w:hint="eastAsia"/>
+        </w:rPr>
+        <w:t>按 topic 分片 seq（如 ai.* / collab.* / viz.*），断线仅补该分片缺口；</w:t>
+      </w:r>
+    </w:p>
+    <w:p>
+      <w:pPr>
+        <w:rPr>
+          <w:rFonts w:hint="eastAsia"/>
+        </w:rPr>
+      </w:pPr>
+    </w:p>
+    <w:p>
+      <w:pPr>
+        <w:rPr>
+          <w:rFonts w:hint="eastAsia"/>
+        </w:rPr>
+      </w:pPr>
+      <w:r>
+        <w:rPr>
+          <w:rFonts w:hint="eastAsia"/>
+        </w:rPr>
+        <w:t>ACK/重试：in-flight 窗口（建议 64）；指数退避，超限丢弃并记录原因码；</w:t>
+      </w:r>
+    </w:p>
+    <w:p>
+      <w:pPr>
+        <w:rPr>
+          <w:rFonts w:hint="eastAsia"/>
+        </w:rPr>
+      </w:pPr>
+    </w:p>
+    <w:p>
+      <w:pPr>
+        <w:rPr>
+          <w:rFonts w:hint="eastAsia"/>
+        </w:rPr>
+      </w:pPr>
+      <w:r>
+        <w:rPr>
+          <w:rFonts w:hint="eastAsia"/>
+        </w:rPr>
+        <w:t>关闭码治理：4000–4999 业务码区间统一字典并上报。</w:t>
+      </w:r>
+    </w:p>
+    <w:p>
+      <w:pPr>
+        <w:rPr>
+          <w:rFonts w:hint="eastAsia"/>
+        </w:rPr>
+      </w:pPr>
+    </w:p>
+    <w:p>
+      <w:pPr>
+        <w:rPr>
+          <w:rFonts w:hint="eastAsia"/>
+        </w:rPr>
+      </w:pPr>
+      <w:r>
+        <w:rPr>
+          <w:rFonts w:hint="eastAsia"/>
+        </w:rPr>
+        <w:t>可视化专用</w:t>
+      </w:r>
+    </w:p>
+    <w:p>
+      <w:pPr>
+        <w:rPr>
+          <w:rFonts w:hint="eastAsia"/>
+        </w:rPr>
+      </w:pPr>
+    </w:p>
+    <w:p>
+      <w:pPr>
+        <w:rPr>
+          <w:rFonts w:hint="eastAsia"/>
+        </w:rPr>
+      </w:pPr>
+      <w:r>
+        <w:rPr>
+          <w:rFonts w:hint="eastAsia"/>
+        </w:rPr>
+        <w:t>viz.frame：frameId, ts, w, h, keyframe?, refId?, fmt=png|diff, dur, idx + 二进制数据；</w:t>
+      </w:r>
+    </w:p>
+    <w:p>
+      <w:pPr>
+        <w:rPr>
+          <w:rFonts w:hint="eastAsia"/>
+        </w:rPr>
+      </w:pPr>
+    </w:p>
+    <w:p>
+      <w:pPr>
+        <w:rPr>
+          <w:rFonts w:hint="eastAsia"/>
+        </w:rPr>
+      </w:pPr>
+      <w:r>
+        <w:rPr>
+          <w:rFonts w:hint="eastAsia"/>
+        </w:rPr>
+        <w:t>viz.event：type=mouse|keyboard, payload...（上行）；</w:t>
+      </w:r>
+    </w:p>
+    <w:p>
+      <w:pPr>
+        <w:rPr>
+          <w:rFonts w:hint="eastAsia"/>
+        </w:rPr>
+      </w:pPr>
+    </w:p>
+    <w:p>
+      <w:pPr>
+        <w:rPr>
+          <w:rFonts w:hint="eastAsia"/>
+        </w:rPr>
+      </w:pPr>
+      <w:r>
+        <w:rPr>
+          <w:rFonts w:hint="eastAsia"/>
+        </w:rPr>
+        <w:t>viz.meta：fpsTarget, fpsActual, dropped, queueDepth；</w:t>
+      </w:r>
+    </w:p>
+    <w:p>
+      <w:pPr>
+        <w:rPr>
+          <w:rFonts w:hint="eastAsia"/>
+        </w:rPr>
+      </w:pPr>
+    </w:p>
+    <w:p>
+      <w:pPr>
+        <w:rPr>
+          <w:rFonts w:hint="eastAsia"/>
+        </w:rPr>
+      </w:pPr>
+      <w:r>
+        <w:rPr>
+          <w:rFonts w:hint="eastAsia"/>
+        </w:rPr>
+        <w:t>SSE 回放：text/event-stream，关键/差分帧的 URL 指针和时间戳索引。</w:t>
+      </w:r>
+    </w:p>
+    <w:p>
+      <w:pPr>
+        <w:rPr>
+          <w:rFonts w:hint="eastAsia"/>
+        </w:rPr>
+      </w:pPr>
+    </w:p>
+    <w:p>
+      <w:pPr>
+        <w:rPr>
+          <w:rFonts w:hint="eastAsia"/>
+        </w:rPr>
+      </w:pPr>
+      <w:r>
+        <w:rPr>
+          <w:rFonts w:hint="eastAsia"/>
+        </w:rPr>
+        <w:t>9️⃣ SLO / 性能目标（MVP 验收扩展·含可视化）</w:t>
+      </w:r>
+    </w:p>
+    <w:p>
+      <w:pPr>
+        <w:rPr>
+          <w:rFonts w:hint="eastAsia"/>
+        </w:rPr>
+      </w:pPr>
+    </w:p>
+    <w:p>
+      <w:pPr>
+        <w:rPr>
+          <w:rFonts w:hint="eastAsia"/>
+        </w:rPr>
+      </w:pPr>
+      <w:r>
+        <w:rPr>
+          <w:rFonts w:hint="eastAsia"/>
+        </w:rPr>
+        <w:t>长连稳定：30 分钟会话 p95 0 次非主动断开；</w:t>
+      </w:r>
+    </w:p>
+    <w:p>
+      <w:pPr>
+        <w:rPr>
+          <w:rFonts w:hint="eastAsia"/>
+        </w:rPr>
+      </w:pPr>
+    </w:p>
+    <w:p>
+      <w:pPr>
+        <w:rPr>
+          <w:rFonts w:hint="eastAsia"/>
+        </w:rPr>
+      </w:pPr>
+      <w:r>
+        <w:rPr>
+          <w:rFonts w:hint="eastAsia"/>
+        </w:rPr>
+        <w:t>重连恢复：滚动重启 30% 网关实例时，90% 会话 ≤3s 恢复并补齐缺口；</w:t>
+      </w:r>
+    </w:p>
+    <w:p>
+      <w:pPr>
+        <w:rPr>
+          <w:rFonts w:hint="eastAsia"/>
+        </w:rPr>
+      </w:pPr>
+    </w:p>
+    <w:p>
+      <w:pPr>
+        <w:rPr>
+          <w:rFonts w:hint="eastAsia"/>
+        </w:rPr>
+      </w:pPr>
+      <w:r>
+        <w:rPr>
+          <w:rFonts w:hint="eastAsia"/>
+        </w:rPr>
+        <w:t>广播延迟：集群公告 p95 ≤ 1s；</w:t>
+      </w:r>
+    </w:p>
+    <w:p>
+      <w:pPr>
+        <w:rPr>
+          <w:rFonts w:hint="eastAsia"/>
+        </w:rPr>
+      </w:pPr>
+    </w:p>
+    <w:p>
+      <w:pPr>
+        <w:rPr>
+          <w:rFonts w:hint="eastAsia"/>
+        </w:rPr>
+      </w:pPr>
+      <w:r>
+        <w:rPr>
+          <w:rFonts w:hint="eastAsia"/>
+        </w:rPr>
+        <w:t>并发规模：支持 10 万 WS 长连（6–10 个网关副本，≥30% 余量）；</w:t>
+      </w:r>
+    </w:p>
+    <w:p>
+      <w:pPr>
+        <w:rPr>
+          <w:rFonts w:hint="eastAsia"/>
+        </w:rPr>
+      </w:pPr>
+    </w:p>
+    <w:p>
+      <w:pPr>
+        <w:rPr>
+          <w:rFonts w:hint="eastAsia"/>
+        </w:rPr>
+      </w:pPr>
+      <w:r>
+        <w:rPr>
+          <w:rFonts w:hint="eastAsia"/>
+        </w:rPr>
+        <w:t>可视化 SLO（新增）：</w:t>
+      </w:r>
+    </w:p>
+    <w:p>
+      <w:pPr>
+        <w:rPr>
+          <w:rFonts w:hint="eastAsia"/>
+        </w:rPr>
+      </w:pPr>
+    </w:p>
+    <w:p>
+      <w:pPr>
+        <w:rPr>
+          <w:rFonts w:hint="eastAsia"/>
+        </w:rPr>
+      </w:pPr>
+      <w:r>
+        <w:rPr>
+          <w:rFonts w:hint="eastAsia"/>
+        </w:rPr>
+        <w:t>帧端到端延迟 p95 ≤ 250ms（本地/近区），</w:t>
+      </w:r>
+    </w:p>
+    <w:p>
+      <w:pPr>
+        <w:rPr>
+          <w:rFonts w:hint="eastAsia"/>
+        </w:rPr>
+      </w:pPr>
+    </w:p>
+    <w:p>
+      <w:pPr>
+        <w:rPr>
+          <w:rFonts w:hint="eastAsia"/>
+        </w:rPr>
+      </w:pPr>
+      <w:r>
+        <w:rPr>
+          <w:rFonts w:hint="eastAsia"/>
+        </w:rPr>
+        <w:t>编辑器内可视化 FPS p50 ≥ 15、丢帧率 p95 ≤ 5%，</w:t>
+      </w:r>
+    </w:p>
+    <w:p>
+      <w:pPr>
+        <w:rPr>
+          <w:rFonts w:hint="eastAsia"/>
+        </w:rPr>
+      </w:pPr>
+    </w:p>
+    <w:p>
+      <w:pPr>
+        <w:rPr>
+          <w:rFonts w:hint="eastAsia"/>
+        </w:rPr>
+      </w:pPr>
+      <w:r>
+        <w:rPr>
+          <w:rFonts w:hint="eastAsia"/>
+        </w:rPr>
+        <w:t>回放启动时间 p95 ≤ 1.5s；</w:t>
+      </w:r>
+    </w:p>
+    <w:p>
+      <w:pPr>
+        <w:rPr>
+          <w:rFonts w:hint="eastAsia"/>
+        </w:rPr>
+      </w:pPr>
+    </w:p>
+    <w:p>
+      <w:pPr>
+        <w:rPr>
+          <w:rFonts w:hint="eastAsia"/>
+        </w:rPr>
+      </w:pPr>
+      <w:r>
+        <w:rPr>
+          <w:rFonts w:hint="eastAsia"/>
+        </w:rPr>
+        <w:t>回滚成功率：金丝雀异常自动回滚 ≥ 95%；</w:t>
+      </w:r>
+    </w:p>
+    <w:p>
+      <w:pPr>
+        <w:rPr>
+          <w:rFonts w:hint="eastAsia"/>
+        </w:rPr>
+      </w:pPr>
+    </w:p>
+    <w:p>
+      <w:pPr>
+        <w:rPr>
+          <w:rFonts w:hint="eastAsia"/>
+        </w:rPr>
+      </w:pPr>
+      <w:r>
+        <w:rPr>
+          <w:rFonts w:hint="eastAsia"/>
+        </w:rPr>
+        <w:t>观测面板必备：会话数、RTT p50/p95、重连率、关闭码 TopN、补发命中率、限流触发率、帧延迟/丢帧/队列深度、AI 成功率、支付回调成功率。</w:t>
+      </w:r>
+    </w:p>
+    <w:p>
+      <w:pPr>
+        <w:rPr>
+          <w:rFonts w:hint="eastAsia"/>
+        </w:rPr>
+      </w:pPr>
+    </w:p>
+    <w:p>
+      <w:pPr>
+        <w:rPr>
+          <w:rFonts w:hint="eastAsia"/>
+        </w:rPr>
+      </w:pPr>
+      <w:r>
+        <w:rPr>
+          <w:rFonts w:hint="eastAsia"/>
+        </w:rPr>
+        <w:t>🔟 PK/荣耀协作（对战与观战的最小可靠面）</w:t>
+      </w:r>
+    </w:p>
+    <w:p>
+      <w:pPr>
+        <w:rPr>
+          <w:rFonts w:hint="eastAsia"/>
+        </w:rPr>
+      </w:pPr>
+    </w:p>
+    <w:p>
+      <w:pPr>
+        <w:rPr>
+          <w:rFonts w:hint="eastAsia"/>
+        </w:rPr>
+      </w:pPr>
+      <w:r>
+        <w:rPr>
+          <w:rFonts w:hint="eastAsia"/>
+        </w:rPr>
+        <w:t>匹配服务：基于段位/胜率的 Elo 变体；</w:t>
+      </w:r>
+    </w:p>
+    <w:p>
+      <w:pPr>
+        <w:rPr>
+          <w:rFonts w:hint="eastAsia"/>
+        </w:rPr>
+      </w:pPr>
+    </w:p>
+    <w:p>
+      <w:pPr>
+        <w:rPr>
+          <w:rFonts w:hint="eastAsia"/>
+        </w:rPr>
+      </w:pPr>
+      <w:r>
+        <w:rPr>
+          <w:rFonts w:hint="eastAsia"/>
+        </w:rPr>
+        <w:t>裁判服务：所有评测在服务端沙箱运行并回传判定；反外挂机制=“仅以服务器运行结果为准”。</w:t>
+      </w:r>
+    </w:p>
+    <w:p>
+      <w:pPr>
+        <w:rPr>
+          <w:rFonts w:hint="eastAsia"/>
+        </w:rPr>
+      </w:pPr>
+    </w:p>
+    <w:p>
+      <w:pPr>
+        <w:rPr>
+          <w:rFonts w:hint="eastAsia"/>
+        </w:rPr>
+      </w:pPr>
+      <w:r>
+        <w:rPr>
+          <w:rFonts w:hint="eastAsia"/>
+        </w:rPr>
+        <w:t>对战通道：pk.state / pk.event / pk.result（WS）；观战走 SSE；</w:t>
+      </w:r>
+    </w:p>
+    <w:p>
+      <w:pPr>
+        <w:rPr>
+          <w:rFonts w:hint="eastAsia"/>
+        </w:rPr>
+      </w:pPr>
+    </w:p>
+    <w:p>
+      <w:r>
+        <w:rPr>
+          <w:rFonts w:hint="eastAsia"/>
+        </w:rPr>
+        <w:t>复盘：保留关键帧与输入事件序列（MinIO + Mongo 索引）；家长端只读观看、点赞/打赏通过 HTTP 侧路。</w:t>
+      </w:r>
+    </w:p>
+    <w:p/>
     <w:p>
       <w:pPr>
         <w:rPr>
@@ -1297,7 +2963,22 @@
         <w:t>🚫 不要写demo，最小运行方案，直接上企业级方案，避免反复修改。</w:t>
       </w:r>
     </w:p>
-    <w:p/>
+    <w:p>
+      <w:r>
+        <w:rPr>
+          <w:rFonts w:hint="eastAsia"/>
+        </w:rPr>
+        <w:br w:type="textWrapping"/>
+      </w:r>
+      <w:r>
+        <w:rPr>
+          <w:rFonts w:hint="eastAsia"/>
+        </w:rPr>
+        <w:br w:type="textWrapping"/>
+      </w:r>
+      <w:bookmarkStart w:id="0" w:name="_GoBack"/>
+      <w:bookmarkEnd w:id="0"/>
+    </w:p>
     <w:sectPr>
       <w:pgSz w:w="12240" w:h="15840"/>
       <w:pgMar w:top="1440" w:right="1800" w:bottom="1440" w:left="1800" w:header="720" w:footer="720" w:gutter="0"/>
@@ -1558,8 +3239,8 @@
     <w:lsdException w:uiPriority="99" w:name="Normal Indent"/>
     <w:lsdException w:uiPriority="99" w:name="footnote text"/>
     <w:lsdException w:uiPriority="99" w:name="annotation text"/>
-    <w:lsdException w:uiPriority="99" w:semiHidden="0" w:name="header"/>
-    <w:lsdException w:uiPriority="99" w:semiHidden="0" w:name="footer"/>
+    <w:lsdException w:qFormat="1" w:uiPriority="99" w:semiHidden="0" w:name="header"/>
+    <w:lsdException w:qFormat="1" w:uiPriority="99" w:semiHidden="0" w:name="footer"/>
     <w:lsdException w:uiPriority="99" w:name="index heading"/>
     <w:lsdException w:qFormat="1" w:uiPriority="35" w:name="caption"/>
     <w:lsdException w:uiPriority="99" w:name="table of figures"/>
@@ -1574,18 +3255,18 @@
     <w:lsdException w:uiPriority="99" w:name="table of authorities"/>
     <w:lsdException w:qFormat="1" w:uiPriority="99" w:semiHidden="0" w:name="macro"/>
     <w:lsdException w:uiPriority="99" w:name="toa heading"/>
-    <w:lsdException w:uiPriority="99" w:semiHidden="0" w:name="List"/>
+    <w:lsdException w:qFormat="1" w:uiPriority="99" w:semiHidden="0" w:name="List"/>
     <w:lsdException w:qFormat="1" w:uiPriority="99" w:semiHidden="0" w:name="List Bullet"/>
-    <w:lsdException w:uiPriority="99" w:semiHidden="0" w:name="List Number"/>
-    <w:lsdException w:uiPriority="99" w:semiHidden="0" w:name="List 2"/>
+    <w:lsdException w:qFormat="1" w:uiPriority="99" w:semiHidden="0" w:name="List Number"/>
+    <w:lsdException w:qFormat="1" w:uiPriority="99" w:semiHidden="0" w:name="List 2"/>
     <w:lsdException w:qFormat="1" w:uiPriority="99" w:semiHidden="0" w:name="List 3"/>
     <w:lsdException w:uiPriority="99" w:name="List 4"/>
     <w:lsdException w:uiPriority="99" w:name="List 5"/>
-    <w:lsdException w:uiPriority="99" w:semiHidden="0" w:name="List Bullet 2"/>
+    <w:lsdException w:qFormat="1" w:uiPriority="99" w:semiHidden="0" w:name="List Bullet 2"/>
     <w:lsdException w:qFormat="1" w:uiPriority="99" w:semiHidden="0" w:name="List Bullet 3"/>
     <w:lsdException w:uiPriority="99" w:name="List Bullet 4"/>
     <w:lsdException w:uiPriority="99" w:name="List Bullet 5"/>
-    <w:lsdException w:uiPriority="99" w:semiHidden="0" w:name="List Number 2"/>
+    <w:lsdException w:qFormat="1" w:uiPriority="99" w:semiHidden="0" w:name="List Number 2"/>
     <w:lsdException w:qFormat="1" w:uiPriority="99" w:semiHidden="0" w:name="List Number 3"/>
     <w:lsdException w:uiPriority="99" w:name="List Number 4"/>
     <w:lsdException w:uiPriority="99" w:name="List Number 5"/>
@@ -1595,9 +3276,9 @@
     <w:lsdException w:qFormat="1" w:uiPriority="1" w:name="Default Paragraph Font"/>
     <w:lsdException w:qFormat="1" w:uiPriority="99" w:semiHidden="0" w:name="Body Text"/>
     <w:lsdException w:uiPriority="99" w:name="Body Text Indent"/>
-    <w:lsdException w:uiPriority="99" w:semiHidden="0" w:name="List Continue"/>
-    <w:lsdException w:uiPriority="99" w:semiHidden="0" w:name="List Continue 2"/>
-    <w:lsdException w:uiPriority="99" w:semiHidden="0" w:name="List Continue 3"/>
+    <w:lsdException w:qFormat="1" w:uiPriority="99" w:semiHidden="0" w:name="List Continue"/>
+    <w:lsdException w:qFormat="1" w:uiPriority="99" w:semiHidden="0" w:name="List Continue 2"/>
+    <w:lsdException w:qFormat="1" w:uiPriority="99" w:semiHidden="0" w:name="List Continue 3"/>
     <w:lsdException w:uiPriority="99" w:name="List Continue 4"/>
     <w:lsdException w:uiPriority="99" w:name="List Continue 5"/>
     <w:lsdException w:uiPriority="99" w:name="Message Header"/>
@@ -1607,7 +3288,7 @@
     <w:lsdException w:uiPriority="99" w:name="Body Text First Indent"/>
     <w:lsdException w:uiPriority="99" w:name="Body Text First Indent 2"/>
     <w:lsdException w:uiPriority="99" w:name="Note Heading"/>
-    <w:lsdException w:uiPriority="99" w:semiHidden="0" w:name="Body Text 2"/>
+    <w:lsdException w:qFormat="1" w:uiPriority="99" w:semiHidden="0" w:name="Body Text 2"/>
     <w:lsdException w:uiPriority="99" w:semiHidden="0" w:name="Body Text 3"/>
     <w:lsdException w:uiPriority="99" w:name="Body Text Indent 2"/>
     <w:lsdException w:uiPriority="99" w:name="Body Text Indent 3"/>
@@ -1619,7 +3300,7 @@
     <w:lsdException w:uiPriority="99" w:name="Document Map"/>
     <w:lsdException w:uiPriority="99" w:name="Plain Text"/>
     <w:lsdException w:uiPriority="99" w:name="E-mail Signature"/>
-    <w:lsdException w:uiPriority="99" w:name="Normal (Web)"/>
+    <w:lsdException w:qFormat="1" w:uiPriority="99" w:name="Normal (Web)"/>
     <w:lsdException w:uiPriority="99" w:name="HTML Acronym"/>
     <w:lsdException w:uiPriority="99" w:name="HTML Address"/>
     <w:lsdException w:uiPriority="99" w:name="HTML Cite"/>
@@ -1678,7 +3359,7 @@
     <w:lsdException w:qFormat="1" w:unhideWhenUsed="0" w:uiPriority="59" w:semiHidden="0" w:name="Table Grid"/>
     <w:lsdException w:uiPriority="99" w:name="Table Theme"/>
     <w:lsdException w:qFormat="1" w:unhideWhenUsed="0" w:uiPriority="1" w:semiHidden="0" w:name="No Spacing"/>
-    <w:lsdException w:unhideWhenUsed="0" w:uiPriority="60" w:semiHidden="0" w:name="Light Shading"/>
+    <w:lsdException w:qFormat="1" w:unhideWhenUsed="0" w:uiPriority="60" w:semiHidden="0" w:name="Light Shading"/>
     <w:lsdException w:qFormat="1" w:unhideWhenUsed="0" w:uiPriority="61" w:semiHidden="0" w:name="Light List"/>
     <w:lsdException w:qFormat="1" w:unhideWhenUsed="0" w:uiPriority="62" w:semiHidden="0" w:name="Light Grid"/>
     <w:lsdException w:qFormat="1" w:unhideWhenUsed="0" w:uiPriority="63" w:semiHidden="0" w:name="Medium Shading 1"/>
@@ -1709,7 +3390,7 @@
     <w:lsdException w:qFormat="1" w:unhideWhenUsed="0" w:uiPriority="71" w:semiHidden="0" w:name="Colorful Shading Accent 1"/>
     <w:lsdException w:qFormat="1" w:unhideWhenUsed="0" w:uiPriority="72" w:semiHidden="0" w:name="Colorful List Accent 1"/>
     <w:lsdException w:qFormat="1" w:unhideWhenUsed="0" w:uiPriority="73" w:semiHidden="0" w:name="Colorful Grid Accent 1"/>
-    <w:lsdException w:unhideWhenUsed="0" w:uiPriority="60" w:semiHidden="0" w:name="Light Shading Accent 2"/>
+    <w:lsdException w:qFormat="1" w:unhideWhenUsed="0" w:uiPriority="60" w:semiHidden="0" w:name="Light Shading Accent 2"/>
     <w:lsdException w:qFormat="1" w:unhideWhenUsed="0" w:uiPriority="61" w:semiHidden="0" w:name="Light List Accent 2"/>
     <w:lsdException w:qFormat="1" w:unhideWhenUsed="0" w:uiPriority="62" w:semiHidden="0" w:name="Light Grid Accent 2"/>
     <w:lsdException w:qFormat="1" w:unhideWhenUsed="0" w:uiPriority="63" w:semiHidden="0" w:name="Medium Shading 1 Accent 2"/>
@@ -1798,7 +3479,7 @@
     <w:name w:val="heading 1"/>
     <w:basedOn w:val="1"/>
     <w:next w:val="1"/>
-    <w:link w:val="138"/>
+    <w:link w:val="139"/>
     <w:qFormat/>
     <w:uiPriority w:val="9"/>
     <w:pPr>
@@ -1820,7 +3501,7 @@
     <w:name w:val="heading 2"/>
     <w:basedOn w:val="1"/>
     <w:next w:val="1"/>
-    <w:link w:val="139"/>
+    <w:link w:val="140"/>
     <w:unhideWhenUsed/>
     <w:qFormat/>
     <w:uiPriority w:val="9"/>
@@ -1848,7 +3529,7 @@
     <w:name w:val="heading 3"/>
     <w:basedOn w:val="1"/>
     <w:next w:val="1"/>
-    <w:link w:val="140"/>
+    <w:link w:val="141"/>
     <w:unhideWhenUsed/>
     <w:qFormat/>
     <w:uiPriority w:val="9"/>
@@ -1874,7 +3555,7 @@
     <w:name w:val="heading 4"/>
     <w:basedOn w:val="1"/>
     <w:next w:val="1"/>
-    <w:link w:val="150"/>
+    <w:link w:val="151"/>
     <w:semiHidden/>
     <w:unhideWhenUsed/>
     <w:qFormat/>
@@ -1903,7 +3584,7 @@
     <w:name w:val="heading 5"/>
     <w:basedOn w:val="1"/>
     <w:next w:val="1"/>
-    <w:link w:val="151"/>
+    <w:link w:val="152"/>
     <w:semiHidden/>
     <w:unhideWhenUsed/>
     <w:qFormat/>
@@ -1923,7 +3604,7 @@
     <w:name w:val="heading 6"/>
     <w:basedOn w:val="1"/>
     <w:next w:val="1"/>
-    <w:link w:val="152"/>
+    <w:link w:val="153"/>
     <w:semiHidden/>
     <w:unhideWhenUsed/>
     <w:qFormat/>
@@ -1945,7 +3626,7 @@
     <w:name w:val="heading 7"/>
     <w:basedOn w:val="1"/>
     <w:next w:val="1"/>
-    <w:link w:val="153"/>
+    <w:link w:val="154"/>
     <w:semiHidden/>
     <w:unhideWhenUsed/>
     <w:qFormat/>
@@ -1975,7 +3656,7 @@
     <w:name w:val="heading 8"/>
     <w:basedOn w:val="1"/>
     <w:next w:val="1"/>
-    <w:link w:val="154"/>
+    <w:link w:val="155"/>
     <w:semiHidden/>
     <w:unhideWhenUsed/>
     <w:qFormat/>
@@ -2002,7 +3683,7 @@
     <w:name w:val="heading 9"/>
     <w:basedOn w:val="1"/>
     <w:next w:val="1"/>
-    <w:link w:val="155"/>
+    <w:link w:val="156"/>
     <w:semiHidden/>
     <w:unhideWhenUsed/>
     <w:qFormat/>
@@ -2030,14 +3711,14 @@
       </w14:textFill>
     </w:rPr>
   </w:style>
-  <w:style w:type="character" w:default="1" w:styleId="132">
+  <w:style w:type="character" w:default="1" w:styleId="133">
     <w:name w:val="Default Paragraph Font"/>
     <w:semiHidden/>
     <w:unhideWhenUsed/>
     <w:qFormat/>
     <w:uiPriority w:val="1"/>
   </w:style>
-  <w:style w:type="table" w:default="1" w:styleId="32">
+  <w:style w:type="table" w:default="1" w:styleId="33">
     <w:name w:val="Normal Table"/>
     <w:semiHidden/>
     <w:unhideWhenUsed/>
@@ -2054,7 +3735,7 @@
   </w:style>
   <w:style w:type="paragraph" w:styleId="2">
     <w:name w:val="macro"/>
-    <w:link w:val="147"/>
+    <w:link w:val="148"/>
     <w:unhideWhenUsed/>
     <w:qFormat/>
     <w:uiPriority w:val="99"/>
@@ -2092,6 +3773,7 @@
     <w:name w:val="List Number 2"/>
     <w:basedOn w:val="1"/>
     <w:unhideWhenUsed/>
+    <w:qFormat/>
     <w:uiPriority w:val="99"/>
     <w:pPr>
       <w:numPr>
@@ -2105,6 +3787,7 @@
     <w:name w:val="List Number"/>
     <w:basedOn w:val="1"/>
     <w:unhideWhenUsed/>
+    <w:qFormat/>
     <w:uiPriority w:val="99"/>
     <w:pPr>
       <w:numPr>
@@ -2155,7 +3838,7 @@
   <w:style w:type="paragraph" w:styleId="17">
     <w:name w:val="Body Text 3"/>
     <w:basedOn w:val="1"/>
-    <w:link w:val="146"/>
+    <w:link w:val="147"/>
     <w:unhideWhenUsed/>
     <w:uiPriority w:val="99"/>
     <w:pPr>
@@ -2183,7 +3866,7 @@
   <w:style w:type="paragraph" w:styleId="19">
     <w:name w:val="Body Text"/>
     <w:basedOn w:val="1"/>
-    <w:link w:val="144"/>
+    <w:link w:val="145"/>
     <w:unhideWhenUsed/>
     <w:qFormat/>
     <w:uiPriority w:val="99"/>
@@ -2209,6 +3892,7 @@
     <w:name w:val="List 2"/>
     <w:basedOn w:val="1"/>
     <w:unhideWhenUsed/>
+    <w:qFormat/>
     <w:uiPriority w:val="99"/>
     <w:pPr>
       <w:ind w:left="720" w:hanging="360"/>
@@ -2219,6 +3903,7 @@
     <w:name w:val="List Continue"/>
     <w:basedOn w:val="1"/>
     <w:unhideWhenUsed/>
+    <w:qFormat/>
     <w:uiPriority w:val="99"/>
     <w:pPr>
       <w:spacing w:after="120"/>
@@ -2230,6 +3915,7 @@
     <w:name w:val="List Bullet 2"/>
     <w:basedOn w:val="1"/>
     <w:unhideWhenUsed/>
+    <w:qFormat/>
     <w:uiPriority w:val="99"/>
     <w:pPr>
       <w:numPr>
@@ -2242,8 +3928,9 @@
   <w:style w:type="paragraph" w:styleId="24">
     <w:name w:val="footer"/>
     <w:basedOn w:val="1"/>
-    <w:link w:val="136"/>
+    <w:link w:val="137"/>
     <w:unhideWhenUsed/>
+    <w:qFormat/>
     <w:uiPriority w:val="99"/>
     <w:pPr>
       <w:tabs>
@@ -2256,8 +3943,9 @@
   <w:style w:type="paragraph" w:styleId="25">
     <w:name w:val="header"/>
     <w:basedOn w:val="1"/>
-    <w:link w:val="135"/>
+    <w:link w:val="136"/>
     <w:unhideWhenUsed/>
+    <w:qFormat/>
     <w:uiPriority w:val="99"/>
     <w:pPr>
       <w:tabs>
@@ -2271,7 +3959,7 @@
     <w:name w:val="Subtitle"/>
     <w:basedOn w:val="1"/>
     <w:next w:val="1"/>
-    <w:link w:val="142"/>
+    <w:link w:val="143"/>
     <w:qFormat/>
     <w:uiPriority w:val="11"/>
     <w:rPr>
@@ -2293,6 +3981,7 @@
     <w:name w:val="List"/>
     <w:basedOn w:val="1"/>
     <w:unhideWhenUsed/>
+    <w:qFormat/>
     <w:uiPriority w:val="99"/>
     <w:pPr>
       <w:ind w:left="360" w:hanging="360"/>
@@ -2302,8 +3991,9 @@
   <w:style w:type="paragraph" w:styleId="28">
     <w:name w:val="Body Text 2"/>
     <w:basedOn w:val="1"/>
-    <w:link w:val="145"/>
+    <w:link w:val="146"/>
     <w:unhideWhenUsed/>
+    <w:qFormat/>
     <w:uiPriority w:val="99"/>
     <w:pPr>
       <w:spacing w:after="120" w:line="480" w:lineRule="auto"/>
@@ -2313,6 +4003,7 @@
     <w:name w:val="List Continue 2"/>
     <w:basedOn w:val="1"/>
     <w:unhideWhenUsed/>
+    <w:qFormat/>
     <w:uiPriority w:val="99"/>
     <w:pPr>
       <w:spacing w:after="120"/>
@@ -2321,9 +4012,28 @@
     </w:pPr>
   </w:style>
   <w:style w:type="paragraph" w:styleId="30">
+    <w:name w:val="Normal (Web)"/>
+    <w:basedOn w:val="1"/>
+    <w:semiHidden/>
+    <w:unhideWhenUsed/>
+    <w:qFormat/>
+    <w:uiPriority w:val="99"/>
+    <w:pPr>
+      <w:spacing w:before="0" w:beforeAutospacing="1" w:after="0" w:afterAutospacing="1"/>
+      <w:ind w:left="0" w:right="0"/>
+      <w:jc w:val="left"/>
+    </w:pPr>
+    <w:rPr>
+      <w:kern w:val="0"/>
+      <w:sz w:val="24"/>
+      <w:lang w:val="en-US" w:eastAsia="zh-CN" w:bidi="ar"/>
+    </w:rPr>
+  </w:style>
+  <w:style w:type="paragraph" w:styleId="31">
     <w:name w:val="List Continue 3"/>
     <w:basedOn w:val="1"/>
     <w:unhideWhenUsed/>
+    <w:qFormat/>
     <w:uiPriority w:val="99"/>
     <w:pPr>
       <w:spacing w:after="120"/>
@@ -2331,11 +4041,11 @@
       <w:contextualSpacing/>
     </w:pPr>
   </w:style>
-  <w:style w:type="paragraph" w:styleId="31">
+  <w:style w:type="paragraph" w:styleId="32">
     <w:name w:val="Title"/>
     <w:basedOn w:val="1"/>
     <w:next w:val="1"/>
-    <w:link w:val="141"/>
+    <w:link w:val="142"/>
     <w:qFormat/>
     <w:uiPriority w:val="10"/>
     <w:pPr>
@@ -2354,9 +4064,9 @@
       <w:szCs w:val="52"/>
     </w:rPr>
   </w:style>
-  <w:style w:type="table" w:styleId="33">
+  <w:style w:type="table" w:styleId="34">
     <w:name w:val="Table Grid"/>
-    <w:basedOn w:val="32"/>
+    <w:basedOn w:val="33"/>
     <w:qFormat/>
     <w:uiPriority w:val="59"/>
     <w:pPr>
@@ -2379,9 +4089,10 @@
       </w:tblCellMar>
     </w:tblPr>
   </w:style>
-  <w:style w:type="table" w:styleId="34">
+  <w:style w:type="table" w:styleId="35">
     <w:name w:val="Light Shading"/>
-    <w:basedOn w:val="32"/>
+    <w:basedOn w:val="33"/>
+    <w:qFormat/>
     <w:uiPriority w:val="60"/>
     <w:pPr>
       <w:spacing w:after="0" w:line="240" w:lineRule="auto"/>
@@ -2478,9 +4189,9 @@
       </w:tcPr>
     </w:tblStylePr>
   </w:style>
-  <w:style w:type="table" w:styleId="35">
+  <w:style w:type="table" w:styleId="36">
     <w:name w:val="Light Shading Accent 1"/>
-    <w:basedOn w:val="32"/>
+    <w:basedOn w:val="33"/>
     <w:qFormat/>
     <w:uiPriority w:val="60"/>
     <w:pPr>
@@ -2578,9 +4289,10 @@
       </w:tcPr>
     </w:tblStylePr>
   </w:style>
-  <w:style w:type="table" w:styleId="36">
+  <w:style w:type="table" w:styleId="37">
     <w:name w:val="Light Shading Accent 2"/>
-    <w:basedOn w:val="32"/>
+    <w:basedOn w:val="33"/>
+    <w:qFormat/>
     <w:uiPriority w:val="60"/>
     <w:pPr>
       <w:spacing w:after="0" w:line="240" w:lineRule="auto"/>
@@ -2677,9 +4389,9 @@
       </w:tcPr>
     </w:tblStylePr>
   </w:style>
-  <w:style w:type="table" w:styleId="37">
+  <w:style w:type="table" w:styleId="38">
     <w:name w:val="Light Shading Accent 3"/>
-    <w:basedOn w:val="32"/>
+    <w:basedOn w:val="33"/>
     <w:qFormat/>
     <w:uiPriority w:val="60"/>
     <w:pPr>
@@ -2777,9 +4489,9 @@
       </w:tcPr>
     </w:tblStylePr>
   </w:style>
-  <w:style w:type="table" w:styleId="38">
+  <w:style w:type="table" w:styleId="39">
     <w:name w:val="Light Shading Accent 4"/>
-    <w:basedOn w:val="32"/>
+    <w:basedOn w:val="33"/>
     <w:qFormat/>
     <w:uiPriority w:val="60"/>
     <w:pPr>
@@ -2877,9 +4589,9 @@
       </w:tcPr>
     </w:tblStylePr>
   </w:style>
-  <w:style w:type="table" w:styleId="39">
+  <w:style w:type="table" w:styleId="40">
     <w:name w:val="Light Shading Accent 5"/>
-    <w:basedOn w:val="32"/>
+    <w:basedOn w:val="33"/>
     <w:qFormat/>
     <w:uiPriority w:val="60"/>
     <w:pPr>
@@ -2977,9 +4689,9 @@
       </w:tcPr>
     </w:tblStylePr>
   </w:style>
-  <w:style w:type="table" w:styleId="40">
+  <w:style w:type="table" w:styleId="41">
     <w:name w:val="Light Shading Accent 6"/>
-    <w:basedOn w:val="32"/>
+    <w:basedOn w:val="33"/>
     <w:qFormat/>
     <w:uiPriority w:val="60"/>
     <w:pPr>
@@ -3077,9 +4789,9 @@
       </w:tcPr>
     </w:tblStylePr>
   </w:style>
-  <w:style w:type="table" w:styleId="41">
+  <w:style w:type="table" w:styleId="42">
     <w:name w:val="Light List"/>
-    <w:basedOn w:val="32"/>
+    <w:basedOn w:val="33"/>
     <w:qFormat/>
     <w:uiPriority w:val="61"/>
     <w:pPr>
@@ -3171,9 +4883,9 @@
       </w:tcPr>
     </w:tblStylePr>
   </w:style>
-  <w:style w:type="table" w:styleId="42">
+  <w:style w:type="table" w:styleId="43">
     <w:name w:val="Light List Accent 1"/>
-    <w:basedOn w:val="32"/>
+    <w:basedOn w:val="33"/>
     <w:qFormat/>
     <w:uiPriority w:val="61"/>
     <w:pPr>
@@ -3265,9 +4977,9 @@
       </w:tcPr>
     </w:tblStylePr>
   </w:style>
-  <w:style w:type="table" w:styleId="43">
+  <w:style w:type="table" w:styleId="44">
     <w:name w:val="Light List Accent 2"/>
-    <w:basedOn w:val="32"/>
+    <w:basedOn w:val="33"/>
     <w:qFormat/>
     <w:uiPriority w:val="61"/>
     <w:pPr>
@@ -3359,9 +5071,9 @@
       </w:tcPr>
     </w:tblStylePr>
   </w:style>
-  <w:style w:type="table" w:styleId="44">
+  <w:style w:type="table" w:styleId="45">
     <w:name w:val="Light List Accent 3"/>
-    <w:basedOn w:val="32"/>
+    <w:basedOn w:val="33"/>
     <w:qFormat/>
     <w:uiPriority w:val="61"/>
     <w:pPr>
@@ -3453,9 +5165,9 @@
       </w:tcPr>
     </w:tblStylePr>
   </w:style>
-  <w:style w:type="table" w:styleId="45">
+  <w:style w:type="table" w:styleId="46">
     <w:name w:val="Light List Accent 4"/>
-    <w:basedOn w:val="32"/>
+    <w:basedOn w:val="33"/>
     <w:qFormat/>
     <w:uiPriority w:val="61"/>
     <w:pPr>
@@ -3547,9 +5259,9 @@
       </w:tcPr>
     </w:tblStylePr>
   </w:style>
-  <w:style w:type="table" w:styleId="46">
+  <w:style w:type="table" w:styleId="47">
     <w:name w:val="Light List Accent 5"/>
-    <w:basedOn w:val="32"/>
+    <w:basedOn w:val="33"/>
     <w:qFormat/>
     <w:uiPriority w:val="61"/>
     <w:pPr>
@@ -3641,9 +5353,9 @@
       </w:tcPr>
     </w:tblStylePr>
   </w:style>
-  <w:style w:type="table" w:styleId="47">
+  <w:style w:type="table" w:styleId="48">
     <w:name w:val="Light List Accent 6"/>
-    <w:basedOn w:val="32"/>
+    <w:basedOn w:val="33"/>
     <w:qFormat/>
     <w:uiPriority w:val="61"/>
     <w:pPr>
@@ -3735,9 +5447,9 @@
       </w:tcPr>
     </w:tblStylePr>
   </w:style>
-  <w:style w:type="table" w:styleId="48">
+  <w:style w:type="table" w:styleId="49">
     <w:name w:val="Light Grid"/>
-    <w:basedOn w:val="32"/>
+    <w:basedOn w:val="33"/>
     <w:qFormat/>
     <w:uiPriority w:val="62"/>
     <w:pPr>
@@ -3862,9 +5574,9 @@
       </w:tcPr>
     </w:tblStylePr>
   </w:style>
-  <w:style w:type="table" w:styleId="49">
+  <w:style w:type="table" w:styleId="50">
     <w:name w:val="Light Grid Accent 1"/>
-    <w:basedOn w:val="32"/>
+    <w:basedOn w:val="33"/>
     <w:qFormat/>
     <w:uiPriority w:val="62"/>
     <w:pPr>
@@ -3989,9 +5701,9 @@
       </w:tcPr>
     </w:tblStylePr>
   </w:style>
-  <w:style w:type="table" w:styleId="50">
+  <w:style w:type="table" w:styleId="51">
     <w:name w:val="Light Grid Accent 2"/>
-    <w:basedOn w:val="32"/>
+    <w:basedOn w:val="33"/>
     <w:qFormat/>
     <w:uiPriority w:val="62"/>
     <w:pPr>
@@ -4116,9 +5828,9 @@
       </w:tcPr>
     </w:tblStylePr>
   </w:style>
-  <w:style w:type="table" w:styleId="51">
+  <w:style w:type="table" w:styleId="52">
     <w:name w:val="Light Grid Accent 3"/>
-    <w:basedOn w:val="32"/>
+    <w:basedOn w:val="33"/>
     <w:qFormat/>
     <w:uiPriority w:val="62"/>
     <w:pPr>
@@ -4243,9 +5955,9 @@
       </w:tcPr>
     </w:tblStylePr>
   </w:style>
-  <w:style w:type="table" w:styleId="52">
+  <w:style w:type="table" w:styleId="53">
     <w:name w:val="Light Grid Accent 4"/>
-    <w:basedOn w:val="32"/>
+    <w:basedOn w:val="33"/>
     <w:qFormat/>
     <w:uiPriority w:val="62"/>
     <w:pPr>
@@ -4370,9 +6082,9 @@
       </w:tcPr>
     </w:tblStylePr>
   </w:style>
-  <w:style w:type="table" w:styleId="53">
+  <w:style w:type="table" w:styleId="54">
     <w:name w:val="Light Grid Accent 5"/>
-    <w:basedOn w:val="32"/>
+    <w:basedOn w:val="33"/>
     <w:qFormat/>
     <w:uiPriority w:val="62"/>
     <w:pPr>
@@ -4497,9 +6209,9 @@
       </w:tcPr>
     </w:tblStylePr>
   </w:style>
-  <w:style w:type="table" w:styleId="54">
+  <w:style w:type="table" w:styleId="55">
     <w:name w:val="Light Grid Accent 6"/>
-    <w:basedOn w:val="32"/>
+    <w:basedOn w:val="33"/>
     <w:qFormat/>
     <w:uiPriority w:val="62"/>
     <w:pPr>
@@ -4624,9 +6336,9 @@
       </w:tcPr>
     </w:tblStylePr>
   </w:style>
-  <w:style w:type="table" w:styleId="55">
+  <w:style w:type="table" w:styleId="56">
     <w:name w:val="Medium Shading 1"/>
-    <w:basedOn w:val="32"/>
+    <w:basedOn w:val="33"/>
     <w:qFormat/>
     <w:uiPriority w:val="63"/>
     <w:pPr>
@@ -4732,9 +6444,9 @@
       </w:tcPr>
     </w:tblStylePr>
   </w:style>
-  <w:style w:type="table" w:styleId="56">
+  <w:style w:type="table" w:styleId="57">
     <w:name w:val="Medium Shading 1 Accent 1"/>
-    <w:basedOn w:val="32"/>
+    <w:basedOn w:val="33"/>
     <w:qFormat/>
     <w:uiPriority w:val="63"/>
     <w:pPr>
@@ -4840,9 +6552,9 @@
       </w:tcPr>
     </w:tblStylePr>
   </w:style>
-  <w:style w:type="table" w:styleId="57">
+  <w:style w:type="table" w:styleId="58">
     <w:name w:val="Medium Shading 1 Accent 2"/>
-    <w:basedOn w:val="32"/>
+    <w:basedOn w:val="33"/>
     <w:qFormat/>
     <w:uiPriority w:val="63"/>
     <w:pPr>
@@ -4948,9 +6660,9 @@
       </w:tcPr>
     </w:tblStylePr>
   </w:style>
-  <w:style w:type="table" w:styleId="58">
+  <w:style w:type="table" w:styleId="59">
     <w:name w:val="Medium Shading 1 Accent 3"/>
-    <w:basedOn w:val="32"/>
+    <w:basedOn w:val="33"/>
     <w:qFormat/>
     <w:uiPriority w:val="63"/>
     <w:pPr>
@@ -5056,9 +6768,9 @@
       </w:tcPr>
     </w:tblStylePr>
   </w:style>
-  <w:style w:type="table" w:styleId="59">
+  <w:style w:type="table" w:styleId="60">
     <w:name w:val="Medium Shading 1 Accent 4"/>
-    <w:basedOn w:val="32"/>
+    <w:basedOn w:val="33"/>
     <w:qFormat/>
     <w:uiPriority w:val="63"/>
     <w:pPr>
@@ -5164,9 +6876,9 @@
       </w:tcPr>
     </w:tblStylePr>
   </w:style>
-  <w:style w:type="table" w:styleId="60">
+  <w:style w:type="table" w:styleId="61">
     <w:name w:val="Medium Shading 1 Accent 5"/>
-    <w:basedOn w:val="32"/>
+    <w:basedOn w:val="33"/>
     <w:qFormat/>
     <w:uiPriority w:val="63"/>
     <w:pPr>
@@ -5272,9 +6984,9 @@
       </w:tcPr>
     </w:tblStylePr>
   </w:style>
-  <w:style w:type="table" w:styleId="61">
+  <w:style w:type="table" w:styleId="62">
     <w:name w:val="Medium Shading 1 Accent 6"/>
-    <w:basedOn w:val="32"/>
+    <w:basedOn w:val="33"/>
     <w:qFormat/>
     <w:uiPriority w:val="63"/>
     <w:pPr>
@@ -5380,9 +7092,9 @@
       </w:tcPr>
     </w:tblStylePr>
   </w:style>
-  <w:style w:type="table" w:styleId="62">
+  <w:style w:type="table" w:styleId="63">
     <w:name w:val="Medium Shading 2"/>
-    <w:basedOn w:val="32"/>
+    <w:basedOn w:val="33"/>
     <w:qFormat/>
     <w:uiPriority w:val="64"/>
     <w:pPr>
@@ -5546,9 +7258,9 @@
       </w:tcPr>
     </w:tblStylePr>
   </w:style>
-  <w:style w:type="table" w:styleId="63">
+  <w:style w:type="table" w:styleId="64">
     <w:name w:val="Medium Shading 2 Accent 1"/>
-    <w:basedOn w:val="32"/>
+    <w:basedOn w:val="33"/>
     <w:qFormat/>
     <w:uiPriority w:val="64"/>
     <w:pPr>
@@ -5712,9 +7424,9 @@
       </w:tcPr>
     </w:tblStylePr>
   </w:style>
-  <w:style w:type="table" w:styleId="64">
+  <w:style w:type="table" w:styleId="65">
     <w:name w:val="Medium Shading 2 Accent 2"/>
-    <w:basedOn w:val="32"/>
+    <w:basedOn w:val="33"/>
     <w:qFormat/>
     <w:uiPriority w:val="64"/>
     <w:pPr>
@@ -5878,9 +7590,9 @@
       </w:tcPr>
     </w:tblStylePr>
   </w:style>
-  <w:style w:type="table" w:styleId="65">
+  <w:style w:type="table" w:styleId="66">
     <w:name w:val="Medium Shading 2 Accent 3"/>
-    <w:basedOn w:val="32"/>
+    <w:basedOn w:val="33"/>
     <w:qFormat/>
     <w:uiPriority w:val="64"/>
     <w:pPr>
@@ -6044,9 +7756,9 @@
       </w:tcPr>
     </w:tblStylePr>
   </w:style>
-  <w:style w:type="table" w:styleId="66">
+  <w:style w:type="table" w:styleId="67">
     <w:name w:val="Medium Shading 2 Accent 4"/>
-    <w:basedOn w:val="32"/>
+    <w:basedOn w:val="33"/>
     <w:qFormat/>
     <w:uiPriority w:val="64"/>
     <w:pPr>
@@ -6210,9 +7922,9 @@
       </w:tcPr>
     </w:tblStylePr>
   </w:style>
-  <w:style w:type="table" w:styleId="67">
+  <w:style w:type="table" w:styleId="68">
     <w:name w:val="Medium Shading 2 Accent 5"/>
-    <w:basedOn w:val="32"/>
+    <w:basedOn w:val="33"/>
     <w:qFormat/>
     <w:uiPriority w:val="64"/>
     <w:pPr>
@@ -6376,9 +8088,9 @@
       </w:tcPr>
     </w:tblStylePr>
   </w:style>
-  <w:style w:type="table" w:styleId="68">
+  <w:style w:type="table" w:styleId="69">
     <w:name w:val="Medium Shading 2 Accent 6"/>
-    <w:basedOn w:val="32"/>
+    <w:basedOn w:val="33"/>
     <w:qFormat/>
     <w:uiPriority w:val="64"/>
     <w:pPr>
@@ -6542,9 +8254,9 @@
       </w:tcPr>
     </w:tblStylePr>
   </w:style>
-  <w:style w:type="table" w:styleId="69">
+  <w:style w:type="table" w:styleId="70">
     <w:name w:val="Medium List 1"/>
-    <w:basedOn w:val="32"/>
+    <w:basedOn w:val="33"/>
     <w:qFormat/>
     <w:uiPriority w:val="65"/>
     <w:pPr>
@@ -6633,9 +8345,9 @@
       </w:tcPr>
     </w:tblStylePr>
   </w:style>
-  <w:style w:type="table" w:styleId="70">
+  <w:style w:type="table" w:styleId="71">
     <w:name w:val="Medium List 1 Accent 1"/>
-    <w:basedOn w:val="32"/>
+    <w:basedOn w:val="33"/>
     <w:qFormat/>
     <w:uiPriority w:val="65"/>
     <w:pPr>
@@ -6724,9 +8436,9 @@
       </w:tcPr>
     </w:tblStylePr>
   </w:style>
-  <w:style w:type="table" w:styleId="71">
+  <w:style w:type="table" w:styleId="72">
     <w:name w:val="Medium List 1 Accent 2"/>
-    <w:basedOn w:val="32"/>
+    <w:basedOn w:val="33"/>
     <w:qFormat/>
     <w:uiPriority w:val="65"/>
     <w:pPr>
@@ -6815,9 +8527,9 @@
       </w:tcPr>
     </w:tblStylePr>
   </w:style>
-  <w:style w:type="table" w:styleId="72">
+  <w:style w:type="table" w:styleId="73">
     <w:name w:val="Medium List 1 Accent 3"/>
-    <w:basedOn w:val="32"/>
+    <w:basedOn w:val="33"/>
     <w:qFormat/>
     <w:uiPriority w:val="65"/>
     <w:pPr>
@@ -6906,9 +8618,9 @@
       </w:tcPr>
     </w:tblStylePr>
   </w:style>
-  <w:style w:type="table" w:styleId="73">
+  <w:style w:type="table" w:styleId="74">
     <w:name w:val="Medium List 1 Accent 4"/>
-    <w:basedOn w:val="32"/>
+    <w:basedOn w:val="33"/>
     <w:qFormat/>
     <w:uiPriority w:val="65"/>
     <w:pPr>
@@ -6997,9 +8709,9 @@
       </w:tcPr>
     </w:tblStylePr>
   </w:style>
-  <w:style w:type="table" w:styleId="74">
+  <w:style w:type="table" w:styleId="75">
     <w:name w:val="Medium List 1 Accent 5"/>
-    <w:basedOn w:val="32"/>
+    <w:basedOn w:val="33"/>
     <w:qFormat/>
     <w:uiPriority w:val="65"/>
     <w:pPr>
@@ -7088,9 +8800,9 @@
       </w:tcPr>
     </w:tblStylePr>
   </w:style>
-  <w:style w:type="table" w:styleId="75">
+  <w:style w:type="table" w:styleId="76">
     <w:name w:val="Medium List 1 Accent 6"/>
-    <w:basedOn w:val="32"/>
+    <w:basedOn w:val="33"/>
     <w:qFormat/>
     <w:uiPriority w:val="65"/>
     <w:pPr>
@@ -7179,9 +8891,9 @@
       </w:tcPr>
     </w:tblStylePr>
   </w:style>
-  <w:style w:type="table" w:styleId="76">
+  <w:style w:type="table" w:styleId="77">
     <w:name w:val="Medium List 2"/>
-    <w:basedOn w:val="32"/>
+    <w:basedOn w:val="33"/>
     <w:qFormat/>
     <w:uiPriority w:val="66"/>
     <w:pPr>
@@ -7309,9 +9021,9 @@
       </w:tcPr>
     </w:tblStylePr>
   </w:style>
-  <w:style w:type="table" w:styleId="77">
+  <w:style w:type="table" w:styleId="78">
     <w:name w:val="Medium List 2 Accent 1"/>
-    <w:basedOn w:val="32"/>
+    <w:basedOn w:val="33"/>
     <w:qFormat/>
     <w:uiPriority w:val="66"/>
     <w:pPr>
@@ -7439,9 +9151,9 @@
       </w:tcPr>
     </w:tblStylePr>
   </w:style>
-  <w:style w:type="table" w:styleId="78">
+  <w:style w:type="table" w:styleId="79">
     <w:name w:val="Medium List 2 Accent 2"/>
-    <w:basedOn w:val="32"/>
+    <w:basedOn w:val="33"/>
     <w:qFormat/>
     <w:uiPriority w:val="66"/>
     <w:pPr>
@@ -7569,9 +9281,9 @@
       </w:tcPr>
     </w:tblStylePr>
   </w:style>
-  <w:style w:type="table" w:styleId="79">
+  <w:style w:type="table" w:styleId="80">
     <w:name w:val="Medium List 2 Accent 3"/>
-    <w:basedOn w:val="32"/>
+    <w:basedOn w:val="33"/>
     <w:qFormat/>
     <w:uiPriority w:val="66"/>
     <w:pPr>
@@ -7699,9 +9411,9 @@
       </w:tcPr>
     </w:tblStylePr>
   </w:style>
-  <w:style w:type="table" w:styleId="80">
+  <w:style w:type="table" w:styleId="81">
     <w:name w:val="Medium List 2 Accent 4"/>
-    <w:basedOn w:val="32"/>
+    <w:basedOn w:val="33"/>
     <w:qFormat/>
     <w:uiPriority w:val="66"/>
     <w:pPr>
@@ -7829,9 +9541,9 @@
       </w:tcPr>
     </w:tblStylePr>
   </w:style>
-  <w:style w:type="table" w:styleId="81">
+  <w:style w:type="table" w:styleId="82">
     <w:name w:val="Medium List 2 Accent 5"/>
-    <w:basedOn w:val="32"/>
+    <w:basedOn w:val="33"/>
     <w:qFormat/>
     <w:uiPriority w:val="66"/>
     <w:pPr>
@@ -7959,9 +9671,9 @@
       </w:tcPr>
     </w:tblStylePr>
   </w:style>
-  <w:style w:type="table" w:styleId="82">
+  <w:style w:type="table" w:styleId="83">
     <w:name w:val="Medium List 2 Accent 6"/>
-    <w:basedOn w:val="32"/>
+    <w:basedOn w:val="33"/>
     <w:qFormat/>
     <w:uiPriority w:val="66"/>
     <w:pPr>
@@ -8089,9 +9801,9 @@
       </w:tcPr>
     </w:tblStylePr>
   </w:style>
-  <w:style w:type="table" w:styleId="83">
+  <w:style w:type="table" w:styleId="84">
     <w:name w:val="Medium Grid 1"/>
-    <w:basedOn w:val="32"/>
+    <w:basedOn w:val="33"/>
     <w:qFormat/>
     <w:uiPriority w:val="67"/>
     <w:pPr>
@@ -8159,9 +9871,9 @@
       </w:tcPr>
     </w:tblStylePr>
   </w:style>
-  <w:style w:type="table" w:styleId="84">
+  <w:style w:type="table" w:styleId="85">
     <w:name w:val="Medium Grid 1 Accent 1"/>
-    <w:basedOn w:val="32"/>
+    <w:basedOn w:val="33"/>
     <w:qFormat/>
     <w:uiPriority w:val="67"/>
     <w:pPr>
@@ -8229,9 +9941,9 @@
       </w:tcPr>
     </w:tblStylePr>
   </w:style>
-  <w:style w:type="table" w:styleId="85">
+  <w:style w:type="table" w:styleId="86">
     <w:name w:val="Medium Grid 1 Accent 2"/>
-    <w:basedOn w:val="32"/>
+    <w:basedOn w:val="33"/>
     <w:qFormat/>
     <w:uiPriority w:val="67"/>
     <w:pPr>
@@ -8299,9 +10011,9 @@
       </w:tcPr>
     </w:tblStylePr>
   </w:style>
-  <w:style w:type="table" w:styleId="86">
+  <w:style w:type="table" w:styleId="87">
     <w:name w:val="Medium Grid 1 Accent 3"/>
-    <w:basedOn w:val="32"/>
+    <w:basedOn w:val="33"/>
     <w:qFormat/>
     <w:uiPriority w:val="67"/>
     <w:pPr>
@@ -8369,9 +10081,9 @@
       </w:tcPr>
     </w:tblStylePr>
   </w:style>
-  <w:style w:type="table" w:styleId="87">
+  <w:style w:type="table" w:styleId="88">
     <w:name w:val="Medium Grid 1 Accent 4"/>
-    <w:basedOn w:val="32"/>
+    <w:basedOn w:val="33"/>
     <w:qFormat/>
     <w:uiPriority w:val="67"/>
     <w:pPr>
@@ -8439,9 +10151,9 @@
       </w:tcPr>
     </w:tblStylePr>
   </w:style>
-  <w:style w:type="table" w:styleId="88">
+  <w:style w:type="table" w:styleId="89">
     <w:name w:val="Medium Grid 1 Accent 5"/>
-    <w:basedOn w:val="32"/>
+    <w:basedOn w:val="33"/>
     <w:qFormat/>
     <w:uiPriority w:val="67"/>
     <w:pPr>
@@ -8509,9 +10221,9 @@
       </w:tcPr>
     </w:tblStylePr>
   </w:style>
-  <w:style w:type="table" w:styleId="89">
+  <w:style w:type="table" w:styleId="90">
     <w:name w:val="Medium Grid 1 Accent 6"/>
-    <w:basedOn w:val="32"/>
+    <w:basedOn w:val="33"/>
     <w:qFormat/>
     <w:uiPriority w:val="67"/>
     <w:pPr>
@@ -8579,9 +10291,9 @@
       </w:tcPr>
     </w:tblStylePr>
   </w:style>
-  <w:style w:type="table" w:styleId="90">
+  <w:style w:type="table" w:styleId="91">
     <w:name w:val="Medium Grid 2"/>
-    <w:basedOn w:val="32"/>
+    <w:basedOn w:val="33"/>
     <w:qFormat/>
     <w:uiPriority w:val="68"/>
     <w:pPr>
@@ -8726,9 +10438,9 @@
       </w:tcPr>
     </w:tblStylePr>
   </w:style>
-  <w:style w:type="table" w:styleId="91">
+  <w:style w:type="table" w:styleId="92">
     <w:name w:val="Medium Grid 2 Accent 1"/>
-    <w:basedOn w:val="32"/>
+    <w:basedOn w:val="33"/>
     <w:qFormat/>
     <w:uiPriority w:val="68"/>
     <w:pPr>
@@ -8873,9 +10585,9 @@
       </w:tcPr>
     </w:tblStylePr>
   </w:style>
-  <w:style w:type="table" w:styleId="92">
+  <w:style w:type="table" w:styleId="93">
     <w:name w:val="Medium Grid 2 Accent 2"/>
-    <w:basedOn w:val="32"/>
+    <w:basedOn w:val="33"/>
     <w:qFormat/>
     <w:uiPriority w:val="68"/>
     <w:pPr>
@@ -9020,9 +10732,9 @@
       </w:tcPr>
     </w:tblStylePr>
   </w:style>
-  <w:style w:type="table" w:styleId="93">
+  <w:style w:type="table" w:styleId="94">
     <w:name w:val="Medium Grid 2 Accent 3"/>
-    <w:basedOn w:val="32"/>
+    <w:basedOn w:val="33"/>
     <w:qFormat/>
     <w:uiPriority w:val="68"/>
     <w:pPr>
@@ -9167,9 +10879,9 @@
       </w:tcPr>
     </w:tblStylePr>
   </w:style>
-  <w:style w:type="table" w:styleId="94">
+  <w:style w:type="table" w:styleId="95">
     <w:name w:val="Medium Grid 2 Accent 4"/>
-    <w:basedOn w:val="32"/>
+    <w:basedOn w:val="33"/>
     <w:qFormat/>
     <w:uiPriority w:val="68"/>
     <w:pPr>
@@ -9314,9 +11026,9 @@
       </w:tcPr>
     </w:tblStylePr>
   </w:style>
-  <w:style w:type="table" w:styleId="95">
+  <w:style w:type="table" w:styleId="96">
     <w:name w:val="Medium Grid 2 Accent 5"/>
-    <w:basedOn w:val="32"/>
+    <w:basedOn w:val="33"/>
     <w:qFormat/>
     <w:uiPriority w:val="68"/>
     <w:pPr>
@@ -9461,9 +11173,9 @@
       </w:tcPr>
     </w:tblStylePr>
   </w:style>
-  <w:style w:type="table" w:styleId="96">
+  <w:style w:type="table" w:styleId="97">
     <w:name w:val="Medium Grid 2 Accent 6"/>
-    <w:basedOn w:val="32"/>
+    <w:basedOn w:val="33"/>
     <w:qFormat/>
     <w:uiPriority w:val="68"/>
     <w:pPr>
@@ -9608,9 +11320,9 @@
       </w:tcPr>
     </w:tblStylePr>
   </w:style>
-  <w:style w:type="table" w:styleId="97">
+  <w:style w:type="table" w:styleId="98">
     <w:name w:val="Medium Grid 3"/>
-    <w:basedOn w:val="32"/>
+    <w:basedOn w:val="33"/>
     <w:qFormat/>
     <w:uiPriority w:val="69"/>
     <w:pPr>
@@ -9766,9 +11478,9 @@
       </w:tcPr>
     </w:tblStylePr>
   </w:style>
-  <w:style w:type="table" w:styleId="98">
+  <w:style w:type="table" w:styleId="99">
     <w:name w:val="Medium Grid 3 Accent 1"/>
-    <w:basedOn w:val="32"/>
+    <w:basedOn w:val="33"/>
     <w:qFormat/>
     <w:uiPriority w:val="69"/>
     <w:pPr>
@@ -9924,9 +11636,9 @@
       </w:tcPr>
     </w:tblStylePr>
   </w:style>
-  <w:style w:type="table" w:styleId="99">
+  <w:style w:type="table" w:styleId="100">
     <w:name w:val="Medium Grid 3 Accent 2"/>
-    <w:basedOn w:val="32"/>
+    <w:basedOn w:val="33"/>
     <w:qFormat/>
     <w:uiPriority w:val="69"/>
     <w:pPr>
@@ -10082,9 +11794,9 @@
       </w:tcPr>
     </w:tblStylePr>
   </w:style>
-  <w:style w:type="table" w:styleId="100">
+  <w:style w:type="table" w:styleId="101">
     <w:name w:val="Medium Grid 3 Accent 3"/>
-    <w:basedOn w:val="32"/>
+    <w:basedOn w:val="33"/>
     <w:qFormat/>
     <w:uiPriority w:val="69"/>
     <w:pPr>
@@ -10240,9 +11952,9 @@
       </w:tcPr>
     </w:tblStylePr>
   </w:style>
-  <w:style w:type="table" w:styleId="101">
+  <w:style w:type="table" w:styleId="102">
     <w:name w:val="Medium Grid 3 Accent 4"/>
-    <w:basedOn w:val="32"/>
+    <w:basedOn w:val="33"/>
     <w:qFormat/>
     <w:uiPriority w:val="69"/>
     <w:pPr>
@@ -10398,9 +12110,9 @@
       </w:tcPr>
     </w:tblStylePr>
   </w:style>
-  <w:style w:type="table" w:styleId="102">
+  <w:style w:type="table" w:styleId="103">
     <w:name w:val="Medium Grid 3 Accent 5"/>
-    <w:basedOn w:val="32"/>
+    <w:basedOn w:val="33"/>
     <w:qFormat/>
     <w:uiPriority w:val="69"/>
     <w:pPr>
@@ -10556,9 +12268,9 @@
       </w:tcPr>
     </w:tblStylePr>
   </w:style>
-  <w:style w:type="table" w:styleId="103">
+  <w:style w:type="table" w:styleId="104">
     <w:name w:val="Medium Grid 3 Accent 6"/>
-    <w:basedOn w:val="32"/>
+    <w:basedOn w:val="33"/>
     <w:qFormat/>
     <w:uiPriority w:val="69"/>
     <w:pPr>
@@ -10714,9 +12426,9 @@
       </w:tcPr>
     </w:tblStylePr>
   </w:style>
-  <w:style w:type="table" w:styleId="104">
+  <w:style w:type="table" w:styleId="105">
     <w:name w:val="Dark List"/>
-    <w:basedOn w:val="32"/>
+    <w:basedOn w:val="33"/>
     <w:qFormat/>
     <w:uiPriority w:val="70"/>
     <w:pPr>
@@ -10830,9 +12542,9 @@
       </w:tcPr>
     </w:tblStylePr>
   </w:style>
-  <w:style w:type="table" w:styleId="105">
+  <w:style w:type="table" w:styleId="106">
     <w:name w:val="Dark List Accent 1"/>
-    <w:basedOn w:val="32"/>
+    <w:basedOn w:val="33"/>
     <w:qFormat/>
     <w:uiPriority w:val="70"/>
     <w:pPr>
@@ -10946,9 +12658,9 @@
       </w:tcPr>
     </w:tblStylePr>
   </w:style>
-  <w:style w:type="table" w:styleId="106">
+  <w:style w:type="table" w:styleId="107">
     <w:name w:val="Dark List Accent 2"/>
-    <w:basedOn w:val="32"/>
+    <w:basedOn w:val="33"/>
     <w:qFormat/>
     <w:uiPriority w:val="70"/>
     <w:pPr>
@@ -11062,9 +12774,9 @@
       </w:tcPr>
     </w:tblStylePr>
   </w:style>
-  <w:style w:type="table" w:styleId="107">
+  <w:style w:type="table" w:styleId="108">
     <w:name w:val="Dark List Accent 3"/>
-    <w:basedOn w:val="32"/>
+    <w:basedOn w:val="33"/>
     <w:qFormat/>
     <w:uiPriority w:val="70"/>
     <w:pPr>
@@ -11178,9 +12890,9 @@
       </w:tcPr>
     </w:tblStylePr>
   </w:style>
-  <w:style w:type="table" w:styleId="108">
+  <w:style w:type="table" w:styleId="109">
     <w:name w:val="Dark List Accent 4"/>
-    <w:basedOn w:val="32"/>
+    <w:basedOn w:val="33"/>
     <w:qFormat/>
     <w:uiPriority w:val="70"/>
     <w:pPr>
@@ -11294,9 +13006,9 @@
       </w:tcPr>
     </w:tblStylePr>
   </w:style>
-  <w:style w:type="table" w:styleId="109">
+  <w:style w:type="table" w:styleId="110">
     <w:name w:val="Dark List Accent 5"/>
-    <w:basedOn w:val="32"/>
+    <w:basedOn w:val="33"/>
     <w:qFormat/>
     <w:uiPriority w:val="70"/>
     <w:pPr>
@@ -11410,9 +13122,9 @@
       </w:tcPr>
     </w:tblStylePr>
   </w:style>
-  <w:style w:type="table" w:styleId="110">
+  <w:style w:type="table" w:styleId="111">
     <w:name w:val="Dark List Accent 6"/>
-    <w:basedOn w:val="32"/>
+    <w:basedOn w:val="33"/>
     <w:qFormat/>
     <w:uiPriority w:val="70"/>
     <w:pPr>
@@ -11526,9 +13238,9 @@
       </w:tcPr>
     </w:tblStylePr>
   </w:style>
-  <w:style w:type="table" w:styleId="111">
+  <w:style w:type="table" w:styleId="112">
     <w:name w:val="Colorful Shading"/>
-    <w:basedOn w:val="32"/>
+    <w:basedOn w:val="33"/>
     <w:qFormat/>
     <w:uiPriority w:val="71"/>
     <w:pPr>
@@ -11675,9 +13387,9 @@
       </w:rPr>
     </w:tblStylePr>
   </w:style>
-  <w:style w:type="table" w:styleId="112">
+  <w:style w:type="table" w:styleId="113">
     <w:name w:val="Colorful Shading Accent 1"/>
-    <w:basedOn w:val="32"/>
+    <w:basedOn w:val="33"/>
     <w:qFormat/>
     <w:uiPriority w:val="71"/>
     <w:pPr>
@@ -11824,9 +13536,9 @@
       </w:rPr>
     </w:tblStylePr>
   </w:style>
-  <w:style w:type="table" w:styleId="113">
+  <w:style w:type="table" w:styleId="114">
     <w:name w:val="Colorful Shading Accent 2"/>
-    <w:basedOn w:val="32"/>
+    <w:basedOn w:val="33"/>
     <w:qFormat/>
     <w:uiPriority w:val="71"/>
     <w:pPr>
@@ -11973,9 +13685,9 @@
       </w:rPr>
     </w:tblStylePr>
   </w:style>
-  <w:style w:type="table" w:styleId="114">
+  <w:style w:type="table" w:styleId="115">
     <w:name w:val="Colorful Shading Accent 3"/>
-    <w:basedOn w:val="32"/>
+    <w:basedOn w:val="33"/>
     <w:qFormat/>
     <w:uiPriority w:val="71"/>
     <w:pPr>
@@ -12102,9 +13814,9 @@
       </w:tcPr>
     </w:tblStylePr>
   </w:style>
-  <w:style w:type="table" w:styleId="115">
+  <w:style w:type="table" w:styleId="116">
     <w:name w:val="Colorful Shading Accent 4"/>
-    <w:basedOn w:val="32"/>
+    <w:basedOn w:val="33"/>
     <w:qFormat/>
     <w:uiPriority w:val="71"/>
     <w:pPr>
@@ -12251,9 +13963,9 @@
       </w:rPr>
     </w:tblStylePr>
   </w:style>
-  <w:style w:type="table" w:styleId="116">
+  <w:style w:type="table" w:styleId="117">
     <w:name w:val="Colorful Shading Accent 5"/>
-    <w:basedOn w:val="32"/>
+    <w:basedOn w:val="33"/>
     <w:qFormat/>
     <w:uiPriority w:val="71"/>
     <w:pPr>
@@ -12400,9 +14112,9 @@
       </w:rPr>
     </w:tblStylePr>
   </w:style>
-  <w:style w:type="table" w:styleId="117">
+  <w:style w:type="table" w:styleId="118">
     <w:name w:val="Colorful Shading Accent 6"/>
-    <w:basedOn w:val="32"/>
+    <w:basedOn w:val="33"/>
     <w:qFormat/>
     <w:uiPriority w:val="71"/>
     <w:pPr>
@@ -12549,9 +14261,9 @@
       </w:rPr>
     </w:tblStylePr>
   </w:style>
-  <w:style w:type="table" w:styleId="118">
+  <w:style w:type="table" w:styleId="119">
     <w:name w:val="Colorful List"/>
-    <w:basedOn w:val="32"/>
+    <w:basedOn w:val="33"/>
     <w:qFormat/>
     <w:uiPriority w:val="72"/>
     <w:pPr>
@@ -12642,9 +14354,9 @@
       </w:tcPr>
     </w:tblStylePr>
   </w:style>
-  <w:style w:type="table" w:styleId="119">
+  <w:style w:type="table" w:styleId="120">
     <w:name w:val="Colorful List Accent 1"/>
-    <w:basedOn w:val="32"/>
+    <w:basedOn w:val="33"/>
     <w:qFormat/>
     <w:uiPriority w:val="72"/>
     <w:pPr>
@@ -12735,9 +14447,9 @@
       </w:tcPr>
     </w:tblStylePr>
   </w:style>
-  <w:style w:type="table" w:styleId="120">
+  <w:style w:type="table" w:styleId="121">
     <w:name w:val="Colorful List Accent 2"/>
-    <w:basedOn w:val="32"/>
+    <w:basedOn w:val="33"/>
     <w:qFormat/>
     <w:uiPriority w:val="72"/>
     <w:pPr>
@@ -12828,9 +14540,9 @@
       </w:tcPr>
     </w:tblStylePr>
   </w:style>
-  <w:style w:type="table" w:styleId="121">
+  <w:style w:type="table" w:styleId="122">
     <w:name w:val="Colorful List Accent 3"/>
-    <w:basedOn w:val="32"/>
+    <w:basedOn w:val="33"/>
     <w:qFormat/>
     <w:uiPriority w:val="72"/>
     <w:pPr>
@@ -12921,9 +14633,9 @@
       </w:tcPr>
     </w:tblStylePr>
   </w:style>
-  <w:style w:type="table" w:styleId="122">
+  <w:style w:type="table" w:styleId="123">
     <w:name w:val="Colorful List Accent 4"/>
-    <w:basedOn w:val="32"/>
+    <w:basedOn w:val="33"/>
     <w:qFormat/>
     <w:uiPriority w:val="72"/>
     <w:pPr>
@@ -13014,9 +14726,9 @@
       </w:tcPr>
     </w:tblStylePr>
   </w:style>
-  <w:style w:type="table" w:styleId="123">
+  <w:style w:type="table" w:styleId="124">
     <w:name w:val="Colorful List Accent 5"/>
-    <w:basedOn w:val="32"/>
+    <w:basedOn w:val="33"/>
     <w:qFormat/>
     <w:uiPriority w:val="72"/>
     <w:pPr>
@@ -13107,9 +14819,9 @@
       </w:tcPr>
     </w:tblStylePr>
   </w:style>
-  <w:style w:type="table" w:styleId="124">
+  <w:style w:type="table" w:styleId="125">
     <w:name w:val="Colorful List Accent 6"/>
-    <w:basedOn w:val="32"/>
+    <w:basedOn w:val="33"/>
     <w:qFormat/>
     <w:uiPriority w:val="72"/>
     <w:pPr>
@@ -13200,9 +14912,9 @@
       </w:tcPr>
     </w:tblStylePr>
   </w:style>
-  <w:style w:type="table" w:styleId="125">
+  <w:style w:type="table" w:styleId="126">
     <w:name w:val="Colorful Grid"/>
-    <w:basedOn w:val="32"/>
+    <w:basedOn w:val="33"/>
     <w:qFormat/>
     <w:uiPriority w:val="73"/>
     <w:pPr>
@@ -13297,9 +15009,9 @@
       </w:tcPr>
     </w:tblStylePr>
   </w:style>
-  <w:style w:type="table" w:styleId="126">
+  <w:style w:type="table" w:styleId="127">
     <w:name w:val="Colorful Grid Accent 1"/>
-    <w:basedOn w:val="32"/>
+    <w:basedOn w:val="33"/>
     <w:qFormat/>
     <w:uiPriority w:val="73"/>
     <w:pPr>
@@ -13394,9 +15106,9 @@
       </w:tcPr>
     </w:tblStylePr>
   </w:style>
-  <w:style w:type="table" w:styleId="127">
+  <w:style w:type="table" w:styleId="128">
     <w:name w:val="Colorful Grid Accent 2"/>
-    <w:basedOn w:val="32"/>
+    <w:basedOn w:val="33"/>
     <w:qFormat/>
     <w:uiPriority w:val="73"/>
     <w:pPr>
@@ -13491,9 +15203,9 @@
       </w:tcPr>
     </w:tblStylePr>
   </w:style>
-  <w:style w:type="table" w:styleId="128">
+  <w:style w:type="table" w:styleId="129">
     <w:name w:val="Colorful Grid Accent 3"/>
-    <w:basedOn w:val="32"/>
+    <w:basedOn w:val="33"/>
     <w:qFormat/>
     <w:uiPriority w:val="73"/>
     <w:pPr>
@@ -13588,9 +15300,9 @@
       </w:tcPr>
     </w:tblStylePr>
   </w:style>
-  <w:style w:type="table" w:styleId="129">
+  <w:style w:type="table" w:styleId="130">
     <w:name w:val="Colorful Grid Accent 4"/>
-    <w:basedOn w:val="32"/>
+    <w:basedOn w:val="33"/>
     <w:qFormat/>
     <w:uiPriority w:val="73"/>
     <w:pPr>
@@ -13685,9 +15397,9 @@
       </w:tcPr>
     </w:tblStylePr>
   </w:style>
-  <w:style w:type="table" w:styleId="130">
+  <w:style w:type="table" w:styleId="131">
     <w:name w:val="Colorful Grid Accent 5"/>
-    <w:basedOn w:val="32"/>
+    <w:basedOn w:val="33"/>
     <w:qFormat/>
     <w:uiPriority w:val="73"/>
     <w:pPr>
@@ -13782,9 +15494,9 @@
       </w:tcPr>
     </w:tblStylePr>
   </w:style>
-  <w:style w:type="table" w:styleId="131">
+  <w:style w:type="table" w:styleId="132">
     <w:name w:val="Colorful Grid Accent 6"/>
-    <w:basedOn w:val="32"/>
+    <w:basedOn w:val="33"/>
     <w:qFormat/>
     <w:uiPriority w:val="73"/>
     <w:pPr>
@@ -13879,9 +15591,9 @@
       </w:tcPr>
     </w:tblStylePr>
   </w:style>
-  <w:style w:type="character" w:styleId="133">
+  <w:style w:type="character" w:styleId="134">
     <w:name w:val="Strong"/>
-    <w:basedOn w:val="132"/>
+    <w:basedOn w:val="133"/>
     <w:qFormat/>
     <w:uiPriority w:val="22"/>
     <w:rPr>
@@ -13889,9 +15601,9 @@
       <w:bCs/>
     </w:rPr>
   </w:style>
-  <w:style w:type="character" w:styleId="134">
+  <w:style w:type="character" w:styleId="135">
     <w:name w:val="Emphasis"/>
-    <w:basedOn w:val="132"/>
+    <w:basedOn w:val="133"/>
     <w:qFormat/>
     <w:uiPriority w:val="20"/>
     <w:rPr>
@@ -13899,21 +15611,21 @@
       <w:iCs/>
     </w:rPr>
   </w:style>
-  <w:style w:type="character" w:customStyle="1" w:styleId="135">
+  <w:style w:type="character" w:customStyle="1" w:styleId="136">
     <w:name w:val="Header Char"/>
-    <w:basedOn w:val="132"/>
+    <w:basedOn w:val="133"/>
     <w:link w:val="25"/>
     <w:qFormat/>
     <w:uiPriority w:val="99"/>
   </w:style>
-  <w:style w:type="character" w:customStyle="1" w:styleId="136">
+  <w:style w:type="character" w:customStyle="1" w:styleId="137">
     <w:name w:val="Footer Char"/>
-    <w:basedOn w:val="132"/>
+    <w:basedOn w:val="133"/>
     <w:link w:val="24"/>
     <w:qFormat/>
     <w:uiPriority w:val="99"/>
   </w:style>
-  <w:style w:type="paragraph" w:styleId="137">
+  <w:style w:type="paragraph" w:styleId="138">
     <w:name w:val="No Spacing"/>
     <w:qFormat/>
     <w:uiPriority w:val="1"/>
@@ -13927,9 +15639,9 @@
       <w:lang w:val="en-US" w:eastAsia="en-US" w:bidi="ar-SA"/>
     </w:rPr>
   </w:style>
-  <w:style w:type="character" w:customStyle="1" w:styleId="138">
+  <w:style w:type="character" w:customStyle="1" w:styleId="139">
     <w:name w:val="Heading 1 Char"/>
-    <w:basedOn w:val="132"/>
+    <w:basedOn w:val="133"/>
     <w:link w:val="3"/>
     <w:qFormat/>
     <w:uiPriority w:val="9"/>
@@ -13942,9 +15654,9 @@
       <w:szCs w:val="28"/>
     </w:rPr>
   </w:style>
-  <w:style w:type="character" w:customStyle="1" w:styleId="139">
+  <w:style w:type="character" w:customStyle="1" w:styleId="140">
     <w:name w:val="Heading 2 Char"/>
-    <w:basedOn w:val="132"/>
+    <w:basedOn w:val="133"/>
     <w:link w:val="4"/>
     <w:qFormat/>
     <w:uiPriority w:val="9"/>
@@ -13962,9 +15674,9 @@
       </w14:textFill>
     </w:rPr>
   </w:style>
-  <w:style w:type="character" w:customStyle="1" w:styleId="140">
+  <w:style w:type="character" w:customStyle="1" w:styleId="141">
     <w:name w:val="Heading 3 Char"/>
-    <w:basedOn w:val="132"/>
+    <w:basedOn w:val="133"/>
     <w:link w:val="5"/>
     <w:qFormat/>
     <w:uiPriority w:val="9"/>
@@ -13980,10 +15692,10 @@
       </w14:textFill>
     </w:rPr>
   </w:style>
-  <w:style w:type="character" w:customStyle="1" w:styleId="141">
+  <w:style w:type="character" w:customStyle="1" w:styleId="142">
     <w:name w:val="Title Char"/>
-    <w:basedOn w:val="132"/>
-    <w:link w:val="31"/>
+    <w:basedOn w:val="133"/>
+    <w:link w:val="32"/>
     <w:qFormat/>
     <w:uiPriority w:val="10"/>
     <w:rPr>
@@ -13995,9 +15707,9 @@
       <w:szCs w:val="52"/>
     </w:rPr>
   </w:style>
-  <w:style w:type="character" w:customStyle="1" w:styleId="142">
+  <w:style w:type="character" w:customStyle="1" w:styleId="143">
     <w:name w:val="Subtitle Char"/>
-    <w:basedOn w:val="132"/>
+    <w:basedOn w:val="133"/>
     <w:link w:val="26"/>
     <w:qFormat/>
     <w:uiPriority w:val="11"/>
@@ -14016,7 +15728,7 @@
       </w14:textFill>
     </w:rPr>
   </w:style>
-  <w:style w:type="paragraph" w:styleId="143">
+  <w:style w:type="paragraph" w:styleId="144">
     <w:name w:val="List Paragraph"/>
     <w:basedOn w:val="1"/>
     <w:qFormat/>
@@ -14026,23 +15738,23 @@
       <w:contextualSpacing/>
     </w:pPr>
   </w:style>
-  <w:style w:type="character" w:customStyle="1" w:styleId="144">
+  <w:style w:type="character" w:customStyle="1" w:styleId="145">
     <w:name w:val="Body Text Char"/>
-    <w:basedOn w:val="132"/>
+    <w:basedOn w:val="133"/>
     <w:link w:val="19"/>
     <w:qFormat/>
     <w:uiPriority w:val="99"/>
   </w:style>
-  <w:style w:type="character" w:customStyle="1" w:styleId="145">
+  <w:style w:type="character" w:customStyle="1" w:styleId="146">
     <w:name w:val="Body Text 2 Char"/>
-    <w:basedOn w:val="132"/>
+    <w:basedOn w:val="133"/>
     <w:link w:val="28"/>
     <w:qFormat/>
     <w:uiPriority w:val="99"/>
   </w:style>
-  <w:style w:type="character" w:customStyle="1" w:styleId="146">
+  <w:style w:type="character" w:customStyle="1" w:styleId="147">
     <w:name w:val="Body Text 3 Char"/>
-    <w:basedOn w:val="132"/>
+    <w:basedOn w:val="133"/>
     <w:link w:val="17"/>
     <w:qFormat/>
     <w:uiPriority w:val="99"/>
@@ -14051,9 +15763,9 @@
       <w:szCs w:val="16"/>
     </w:rPr>
   </w:style>
-  <w:style w:type="character" w:customStyle="1" w:styleId="147">
+  <w:style w:type="character" w:customStyle="1" w:styleId="148">
     <w:name w:val="Macro Text Char"/>
-    <w:basedOn w:val="132"/>
+    <w:basedOn w:val="133"/>
     <w:link w:val="2"/>
     <w:qFormat/>
     <w:uiPriority w:val="99"/>
@@ -14063,10 +15775,27 @@
       <w:szCs w:val="20"/>
     </w:rPr>
   </w:style>
-  <w:style w:type="paragraph" w:styleId="148">
+  <w:style w:type="paragraph" w:styleId="149">
     <w:name w:val="Quote"/>
     <w:basedOn w:val="1"/>
     <w:next w:val="1"/>
+    <w:link w:val="150"/>
+    <w:qFormat/>
+    <w:uiPriority w:val="29"/>
+    <w:rPr>
+      <w:i/>
+      <w:iCs/>
+      <w:color w:val="000000" w:themeColor="text1"/>
+      <w14:textFill>
+        <w14:solidFill>
+          <w14:schemeClr w14:val="tx1"/>
+        </w14:solidFill>
+      </w14:textFill>
+    </w:rPr>
+  </w:style>
+  <w:style w:type="character" w:customStyle="1" w:styleId="150">
+    <w:name w:val="Quote Char"/>
+    <w:basedOn w:val="133"/>
     <w:link w:val="149"/>
     <w:qFormat/>
     <w:uiPriority w:val="29"/>
@@ -14081,26 +15810,9 @@
       </w14:textFill>
     </w:rPr>
   </w:style>
-  <w:style w:type="character" w:customStyle="1" w:styleId="149">
-    <w:name w:val="Quote Char"/>
-    <w:basedOn w:val="132"/>
-    <w:link w:val="148"/>
-    <w:qFormat/>
-    <w:uiPriority w:val="29"/>
-    <w:rPr>
-      <w:i/>
-      <w:iCs/>
-      <w:color w:val="000000" w:themeColor="text1"/>
-      <w14:textFill>
-        <w14:solidFill>
-          <w14:schemeClr w14:val="tx1"/>
-        </w14:solidFill>
-      </w14:textFill>
-    </w:rPr>
-  </w:style>
-  <w:style w:type="character" w:customStyle="1" w:styleId="150">
+  <w:style w:type="character" w:customStyle="1" w:styleId="151">
     <w:name w:val="Heading 4 Char"/>
-    <w:basedOn w:val="132"/>
+    <w:basedOn w:val="133"/>
     <w:link w:val="6"/>
     <w:semiHidden/>
     <w:qFormat/>
@@ -14119,9 +15831,9 @@
       </w14:textFill>
     </w:rPr>
   </w:style>
-  <w:style w:type="character" w:customStyle="1" w:styleId="151">
+  <w:style w:type="character" w:customStyle="1" w:styleId="152">
     <w:name w:val="Heading 5 Char"/>
-    <w:basedOn w:val="132"/>
+    <w:basedOn w:val="133"/>
     <w:link w:val="7"/>
     <w:semiHidden/>
     <w:qFormat/>
@@ -14131,9 +15843,9 @@
       <w:color w:val="254061" w:themeColor="accent1" w:themeShade="80"/>
     </w:rPr>
   </w:style>
-  <w:style w:type="character" w:customStyle="1" w:styleId="152">
+  <w:style w:type="character" w:customStyle="1" w:styleId="153">
     <w:name w:val="Heading 6 Char"/>
-    <w:basedOn w:val="132"/>
+    <w:basedOn w:val="133"/>
     <w:link w:val="8"/>
     <w:semiHidden/>
     <w:qFormat/>
@@ -14145,9 +15857,9 @@
       <w:color w:val="254061" w:themeColor="accent1" w:themeShade="80"/>
     </w:rPr>
   </w:style>
-  <w:style w:type="character" w:customStyle="1" w:styleId="153">
+  <w:style w:type="character" w:customStyle="1" w:styleId="154">
     <w:name w:val="Heading 7 Char"/>
-    <w:basedOn w:val="132"/>
+    <w:basedOn w:val="133"/>
     <w:link w:val="9"/>
     <w:semiHidden/>
     <w:qFormat/>
@@ -14167,9 +15879,9 @@
       </w14:textFill>
     </w:rPr>
   </w:style>
-  <w:style w:type="character" w:customStyle="1" w:styleId="154">
+  <w:style w:type="character" w:customStyle="1" w:styleId="155">
     <w:name w:val="Heading 8 Char"/>
-    <w:basedOn w:val="132"/>
+    <w:basedOn w:val="133"/>
     <w:link w:val="10"/>
     <w:semiHidden/>
     <w:qFormat/>
@@ -14186,9 +15898,9 @@
       </w14:textFill>
     </w:rPr>
   </w:style>
-  <w:style w:type="character" w:customStyle="1" w:styleId="155">
+  <w:style w:type="character" w:customStyle="1" w:styleId="156">
     <w:name w:val="Heading 9 Char"/>
-    <w:basedOn w:val="132"/>
+    <w:basedOn w:val="133"/>
     <w:link w:val="11"/>
     <w:semiHidden/>
     <w:qFormat/>
@@ -14210,11 +15922,11 @@
       </w14:textFill>
     </w:rPr>
   </w:style>
-  <w:style w:type="paragraph" w:styleId="156">
+  <w:style w:type="paragraph" w:styleId="157">
     <w:name w:val="Intense Quote"/>
     <w:basedOn w:val="1"/>
     <w:next w:val="1"/>
-    <w:link w:val="157"/>
+    <w:link w:val="158"/>
     <w:qFormat/>
     <w:uiPriority w:val="30"/>
     <w:pPr>
@@ -14237,10 +15949,10 @@
       </w14:textFill>
     </w:rPr>
   </w:style>
-  <w:style w:type="character" w:customStyle="1" w:styleId="157">
+  <w:style w:type="character" w:customStyle="1" w:styleId="158">
     <w:name w:val="Intense Quote Char"/>
-    <w:basedOn w:val="132"/>
-    <w:link w:val="156"/>
+    <w:basedOn w:val="133"/>
+    <w:link w:val="157"/>
     <w:qFormat/>
     <w:uiPriority w:val="30"/>
     <w:rPr>
@@ -14256,9 +15968,9 @@
       </w14:textFill>
     </w:rPr>
   </w:style>
-  <w:style w:type="character" w:customStyle="1" w:styleId="158">
+  <w:style w:type="character" w:customStyle="1" w:styleId="159">
     <w:name w:val="Subtle Emphasis"/>
-    <w:basedOn w:val="132"/>
+    <w:basedOn w:val="133"/>
     <w:qFormat/>
     <w:uiPriority w:val="19"/>
     <w:rPr>
@@ -14275,9 +15987,9 @@
       </w14:textFill>
     </w:rPr>
   </w:style>
-  <w:style w:type="character" w:customStyle="1" w:styleId="159">
+  <w:style w:type="character" w:customStyle="1" w:styleId="160">
     <w:name w:val="Intense Emphasis"/>
-    <w:basedOn w:val="132"/>
+    <w:basedOn w:val="133"/>
     <w:qFormat/>
     <w:uiPriority w:val="21"/>
     <w:rPr>
@@ -14293,9 +16005,9 @@
       </w14:textFill>
     </w:rPr>
   </w:style>
-  <w:style w:type="character" w:customStyle="1" w:styleId="160">
+  <w:style w:type="character" w:customStyle="1" w:styleId="161">
     <w:name w:val="Subtle Reference"/>
-    <w:basedOn w:val="132"/>
+    <w:basedOn w:val="133"/>
     <w:qFormat/>
     <w:uiPriority w:val="31"/>
     <w:rPr>
@@ -14309,9 +16021,9 @@
       </w14:textFill>
     </w:rPr>
   </w:style>
-  <w:style w:type="character" w:customStyle="1" w:styleId="161">
+  <w:style w:type="character" w:customStyle="1" w:styleId="162">
     <w:name w:val="Intense Reference"/>
-    <w:basedOn w:val="132"/>
+    <w:basedOn w:val="133"/>
     <w:qFormat/>
     <w:uiPriority w:val="32"/>
     <w:rPr>
@@ -14328,9 +16040,9 @@
       </w14:textFill>
     </w:rPr>
   </w:style>
-  <w:style w:type="character" w:customStyle="1" w:styleId="162">
+  <w:style w:type="character" w:customStyle="1" w:styleId="163">
     <w:name w:val="Book Title"/>
-    <w:basedOn w:val="132"/>
+    <w:basedOn w:val="133"/>
     <w:qFormat/>
     <w:uiPriority w:val="33"/>
     <w:rPr>
@@ -14340,7 +16052,7 @@
       <w:spacing w:val="5"/>
     </w:rPr>
   </w:style>
-  <w:style w:type="paragraph" w:customStyle="1" w:styleId="163">
+  <w:style w:type="paragraph" w:customStyle="1" w:styleId="164">
     <w:name w:val="TOC Heading"/>
     <w:basedOn w:val="3"/>
     <w:next w:val="1"/>

</xml_diff>